<commit_message>
Seems to be working rather well... I want to compare my work to some other papers: Beyond the Kolmogorov Barrier: A Learnable Weighted Hybrid Autoencoder for Model Order Reduction
So...I want to see what my:
squared Euclidean distance

is for each batch we test in our validation code.
</commit_message>
<xml_diff>
--- a/Documentation/Autoencoder_Details.docx
+++ b/Documentation/Autoencoder_Details.docx
@@ -1135,13 +1135,8 @@
         <w:t xml:space="preserve">The reason that the number of rows/samples is a little “approximate” is that because if a randomly selected value has an </w:t>
       </w:r>
       <w:proofErr w:type="spellStart"/>
-      <w:proofErr w:type="gramStart"/>
-      <w:r>
-        <w:t>x,y</w:t>
-      </w:r>
-      <w:proofErr w:type="gramEnd"/>
-      <w:r>
-        <w:t>,z</w:t>
+      <w:r>
+        <w:t>x,y,z</w:t>
       </w:r>
       <w:proofErr w:type="spellEnd"/>
       <w:r>
@@ -1177,15 +1172,7 @@
         <w:pStyle w:val="ListParagraph"/>
       </w:pPr>
       <w:r>
-        <w:t xml:space="preserve">Regarding “b” above, I believe that there may be 1 or 2 places in the many GB of source data that meet </w:t>
-      </w:r>
-      <w:proofErr w:type="gramStart"/>
-      <w:r>
-        <w:t>this criteria</w:t>
-      </w:r>
-      <w:proofErr w:type="gramEnd"/>
-      <w:r>
-        <w:t>. I did not track this well, but regardless this should be a separate exception that is logged/counted distinctly. This would amount to an enhancement if implemented.</w:t>
+        <w:t>Regarding “b” above, I believe that there may be 1 or 2 places in the many GB of source data that meet this criteria. I did not track this well, but regardless this should be a separate exception that is logged/counted distinctly. This would amount to an enhancement if implemented.</w:t>
       </w:r>
     </w:p>
     <w:p>
@@ -1260,19 +1247,11 @@
           <w:rFonts w:ascii="Courier New" w:hAnsi="Courier New" w:cs="Courier New"/>
         </w:rPr>
       </w:pPr>
-      <w:proofErr w:type="gramStart"/>
-      <w:r>
-        <w:rPr>
-          <w:rFonts w:ascii="Courier New" w:hAnsi="Courier New" w:cs="Courier New"/>
-        </w:rPr>
-        <w:t>#!/</w:t>
-      </w:r>
-      <w:proofErr w:type="gramEnd"/>
-      <w:r>
-        <w:rPr>
-          <w:rFonts w:ascii="Courier New" w:hAnsi="Courier New" w:cs="Courier New"/>
-        </w:rPr>
-        <w:t>bin/bash</w:t>
+      <w:r>
+        <w:rPr>
+          <w:rFonts w:ascii="Courier New" w:hAnsi="Courier New" w:cs="Courier New"/>
+        </w:rPr>
+        <w:t>#!/bin/bash</w:t>
       </w:r>
     </w:p>
     <w:p>
@@ -1314,21 +1293,84 @@
         <w:rPr>
           <w:rFonts w:ascii="Courier New" w:hAnsi="Courier New" w:cs="Courier New"/>
         </w:rPr>
+        <w:t>#SBATCH --job-name=11p4</w:t>
+      </w:r>
+    </w:p>
+    <w:p>
+      <w:pPr>
+        <w:pStyle w:val="PlainText"/>
+        <w:rPr>
+          <w:rFonts w:ascii="Courier New" w:hAnsi="Courier New" w:cs="Courier New"/>
+        </w:rPr>
+      </w:pPr>
+      <w:r>
+        <w:rPr>
+          <w:rFonts w:ascii="Courier New" w:hAnsi="Courier New" w:cs="Courier New"/>
+        </w:rPr>
+        <w:t>#SBATCH -t 21:55:00  # Job time limit</w:t>
+      </w:r>
+    </w:p>
+    <w:p>
+      <w:pPr>
+        <w:pStyle w:val="PlainText"/>
+        <w:rPr>
+          <w:rFonts w:ascii="Courier New" w:hAnsi="Courier New" w:cs="Courier New"/>
+        </w:rPr>
+      </w:pPr>
+      <w:r>
+        <w:rPr>
+          <w:rFonts w:ascii="Courier New" w:hAnsi="Courier New" w:cs="Courier New"/>
+        </w:rPr>
+        <w:t xml:space="preserve">#SBATCH </w:t>
+      </w:r>
+      <w:r>
+        <w:rPr>
+          <w:rFonts w:ascii="Courier New" w:hAnsi="Courier New" w:cs="Courier New"/>
+          <w:highlight w:val="green"/>
+        </w:rPr>
+        <w:t>--array=1-1200</w:t>
+      </w:r>
+    </w:p>
+    <w:p>
+      <w:pPr>
+        <w:pStyle w:val="PlainText"/>
+        <w:rPr>
+          <w:rFonts w:ascii="Courier New" w:hAnsi="Courier New" w:cs="Courier New"/>
+        </w:rPr>
+      </w:pPr>
+      <w:r>
+        <w:rPr>
+          <w:rFonts w:ascii="Courier New" w:hAnsi="Courier New" w:cs="Courier New"/>
+        </w:rPr>
+        <w:t>#SBATCH --nodes=1</w:t>
+      </w:r>
+    </w:p>
+    <w:p>
+      <w:pPr>
+        <w:pStyle w:val="PlainText"/>
+        <w:rPr>
+          <w:rFonts w:ascii="Courier New" w:hAnsi="Courier New" w:cs="Courier New"/>
+        </w:rPr>
+      </w:pPr>
+      <w:r>
+        <w:rPr>
+          <w:rFonts w:ascii="Courier New" w:hAnsi="Courier New" w:cs="Courier New"/>
+        </w:rPr>
         <w:t>#SBATCH --</w:t>
       </w:r>
-      <w:proofErr w:type="gramStart"/>
-      <w:r>
-        <w:rPr>
-          <w:rFonts w:ascii="Courier New" w:hAnsi="Courier New" w:cs="Courier New"/>
-        </w:rPr>
-        <w:t>job-name</w:t>
-      </w:r>
-      <w:proofErr w:type="gramEnd"/>
-      <w:r>
-        <w:rPr>
-          <w:rFonts w:ascii="Courier New" w:hAnsi="Courier New" w:cs="Courier New"/>
-        </w:rPr>
-        <w:t>=11p4</w:t>
+      <w:proofErr w:type="spellStart"/>
+      <w:r>
+        <w:rPr>
+          <w:rFonts w:ascii="Courier New" w:hAnsi="Courier New" w:cs="Courier New"/>
+        </w:rPr>
+        <w:t>ntasks</w:t>
+      </w:r>
+      <w:proofErr w:type="spellEnd"/>
+      <w:r>
+        <w:rPr>
+          <w:rFonts w:ascii="Courier New" w:hAnsi="Courier New" w:cs="Courier New"/>
+        </w:rPr>
+        <w:t>-per-node=4</w:t>
       </w:r>
     </w:p>
     <w:p>
@@ -1342,22 +1384,30 @@
         <w:rPr>
           <w:rFonts w:ascii="Courier New" w:hAnsi="Courier New" w:cs="Courier New"/>
         </w:rPr>
-        <w:t xml:space="preserve">#SBATCH -t </w:t>
-      </w:r>
-      <w:proofErr w:type="gramStart"/>
-      <w:r>
-        <w:rPr>
-          <w:rFonts w:ascii="Courier New" w:hAnsi="Courier New" w:cs="Courier New"/>
-        </w:rPr>
-        <w:t>21:55:00  #</w:t>
-      </w:r>
-      <w:proofErr w:type="gramEnd"/>
-      <w:r>
-        <w:rPr>
-          <w:rFonts w:ascii="Courier New" w:hAnsi="Courier New" w:cs="Courier New"/>
-        </w:rPr>
-        <w:t xml:space="preserve"> Job time limit</w:t>
-      </w:r>
+        <w:t>#SBATCH -o /home/</w:t>
+      </w:r>
+      <w:proofErr w:type="spellStart"/>
+      <w:r>
+        <w:rPr>
+          <w:rFonts w:ascii="Courier New" w:hAnsi="Courier New" w:cs="Courier New"/>
+        </w:rPr>
+        <w:t>kkreth_umassd_edu</w:t>
+      </w:r>
+      <w:proofErr w:type="spellEnd"/>
+      <w:r>
+        <w:rPr>
+          <w:rFonts w:ascii="Courier New" w:hAnsi="Courier New" w:cs="Courier New"/>
+        </w:rPr>
+        <w:t>/logs/%x.%A.%</w:t>
+      </w:r>
+      <w:proofErr w:type="spellStart"/>
+      <w:r>
+        <w:rPr>
+          <w:rFonts w:ascii="Courier New" w:hAnsi="Courier New" w:cs="Courier New"/>
+        </w:rPr>
+        <w:t>a.out</w:t>
+      </w:r>
+      <w:proofErr w:type="spellEnd"/>
     </w:p>
     <w:p>
       <w:pPr>
@@ -1366,19 +1416,6 @@
           <w:rFonts w:ascii="Courier New" w:hAnsi="Courier New" w:cs="Courier New"/>
         </w:rPr>
       </w:pPr>
-      <w:r>
-        <w:rPr>
-          <w:rFonts w:ascii="Courier New" w:hAnsi="Courier New" w:cs="Courier New"/>
-        </w:rPr>
-        <w:t xml:space="preserve">#SBATCH </w:t>
-      </w:r>
-      <w:r>
-        <w:rPr>
-          <w:rFonts w:ascii="Courier New" w:hAnsi="Courier New" w:cs="Courier New"/>
-          <w:highlight w:val="green"/>
-        </w:rPr>
-        <w:t>--array=1-1200</w:t>
-      </w:r>
     </w:p>
     <w:p>
       <w:pPr>
@@ -1391,7 +1428,21 @@
         <w:rPr>
           <w:rFonts w:ascii="Courier New" w:hAnsi="Courier New" w:cs="Courier New"/>
         </w:rPr>
-        <w:t>#SBATCH --nodes=1</w:t>
+        <w:t>source /home/</w:t>
+      </w:r>
+      <w:proofErr w:type="spellStart"/>
+      <w:r>
+        <w:rPr>
+          <w:rFonts w:ascii="Courier New" w:hAnsi="Courier New" w:cs="Courier New"/>
+        </w:rPr>
+        <w:t>kkreth_umassd_edu</w:t>
+      </w:r>
+      <w:proofErr w:type="spellEnd"/>
+      <w:r>
+        <w:rPr>
+          <w:rFonts w:ascii="Courier New" w:hAnsi="Courier New" w:cs="Courier New"/>
+        </w:rPr>
+        <w:t>/_virtual_python_2/bin/activate</w:t>
       </w:r>
     </w:p>
     <w:p>
@@ -1401,25 +1452,75 @@
           <w:rFonts w:ascii="Courier New" w:hAnsi="Courier New" w:cs="Courier New"/>
         </w:rPr>
       </w:pPr>
-      <w:r>
-        <w:rPr>
-          <w:rFonts w:ascii="Courier New" w:hAnsi="Courier New" w:cs="Courier New"/>
-        </w:rPr>
-        <w:t>#SBATCH --</w:t>
+    </w:p>
+    <w:p>
+      <w:pPr>
+        <w:pStyle w:val="PlainText"/>
+        <w:rPr>
+          <w:rFonts w:ascii="Courier New" w:hAnsi="Courier New" w:cs="Courier New"/>
+        </w:rPr>
+      </w:pPr>
+      <w:r>
+        <w:rPr>
+          <w:rFonts w:ascii="Courier New" w:hAnsi="Courier New" w:cs="Courier New"/>
+        </w:rPr>
+        <w:t># Set the directory path</w:t>
+      </w:r>
+    </w:p>
+    <w:p>
+      <w:pPr>
+        <w:pStyle w:val="PlainText"/>
+        <w:rPr>
+          <w:rFonts w:ascii="Courier New" w:hAnsi="Courier New" w:cs="Courier New"/>
+        </w:rPr>
+      </w:pPr>
+      <w:r>
+        <w:rPr>
+          <w:rFonts w:ascii="Courier New" w:hAnsi="Courier New" w:cs="Courier New"/>
+        </w:rPr>
+        <w:t>export PYTHONPATH="${PYTHONPATH}:/home/kkreth_umassd_edu/cgan/production/:/home/kkreth_umassd_edu/cgan/:/home/kkreth_umassd_edu/cgan/production/encoder/"</w:t>
+      </w:r>
+    </w:p>
+    <w:p>
+      <w:pPr>
+        <w:pStyle w:val="PlainText"/>
+        <w:rPr>
+          <w:rFonts w:ascii="Courier New" w:hAnsi="Courier New" w:cs="Courier New"/>
+        </w:rPr>
+      </w:pPr>
+      <w:r>
+        <w:rPr>
+          <w:rFonts w:ascii="Courier New" w:hAnsi="Courier New" w:cs="Courier New"/>
+        </w:rPr>
+        <w:t>cd /home/</w:t>
       </w:r>
       <w:proofErr w:type="spellStart"/>
       <w:r>
         <w:rPr>
           <w:rFonts w:ascii="Courier New" w:hAnsi="Courier New" w:cs="Courier New"/>
         </w:rPr>
-        <w:t>ntasks</w:t>
+        <w:t>kkreth_umassd_edu</w:t>
       </w:r>
       <w:proofErr w:type="spellEnd"/>
       <w:r>
         <w:rPr>
           <w:rFonts w:ascii="Courier New" w:hAnsi="Courier New" w:cs="Courier New"/>
         </w:rPr>
-        <w:t>-per-node=4</w:t>
+        <w:t>/</w:t>
+      </w:r>
+      <w:proofErr w:type="spellStart"/>
+      <w:r>
+        <w:rPr>
+          <w:rFonts w:ascii="Courier New" w:hAnsi="Courier New" w:cs="Courier New"/>
+        </w:rPr>
+        <w:t>cgan</w:t>
+      </w:r>
+      <w:proofErr w:type="spellEnd"/>
+      <w:r>
+        <w:rPr>
+          <w:rFonts w:ascii="Courier New" w:hAnsi="Courier New" w:cs="Courier New"/>
+        </w:rPr>
+        <w:t>/production/</w:t>
       </w:r>
     </w:p>
     <w:p>
@@ -1429,302 +1530,150 @@
           <w:rFonts w:ascii="Courier New" w:hAnsi="Courier New" w:cs="Courier New"/>
         </w:rPr>
       </w:pPr>
-      <w:r>
-        <w:rPr>
-          <w:rFonts w:ascii="Courier New" w:hAnsi="Courier New" w:cs="Courier New"/>
-        </w:rPr>
-        <w:t>#SBATCH -o /home/</w:t>
-      </w:r>
+    </w:p>
+    <w:p>
+      <w:pPr>
+        <w:pStyle w:val="PlainText"/>
+        <w:rPr>
+          <w:rFonts w:ascii="Courier New" w:hAnsi="Courier New" w:cs="Courier New"/>
+        </w:rPr>
+      </w:pPr>
+      <w:r>
+        <w:rPr>
+          <w:rFonts w:ascii="Courier New" w:hAnsi="Courier New" w:cs="Courier New"/>
+        </w:rPr>
+        <w:t># Set the directory path using job name</w:t>
+      </w:r>
+    </w:p>
+    <w:p>
+      <w:pPr>
+        <w:pStyle w:val="PlainText"/>
+        <w:rPr>
+          <w:rFonts w:ascii="Courier New" w:hAnsi="Courier New" w:cs="Courier New"/>
+        </w:rPr>
+      </w:pPr>
+      <w:r>
+        <w:rPr>
+          <w:rFonts w:ascii="Courier New" w:hAnsi="Courier New" w:cs="Courier New"/>
+        </w:rPr>
+        <w:t>directory_path="/home/kkreth_umassd_edu/DL-PTV/${SLURM_JOB_NAME}"</w:t>
+      </w:r>
+    </w:p>
+    <w:p>
+      <w:pPr>
+        <w:pStyle w:val="PlainText"/>
+        <w:rPr>
+          <w:rFonts w:ascii="Courier New" w:hAnsi="Courier New" w:cs="Courier New"/>
+        </w:rPr>
+      </w:pPr>
+    </w:p>
+    <w:p>
+      <w:pPr>
+        <w:pStyle w:val="PlainText"/>
+        <w:rPr>
+          <w:rFonts w:ascii="Courier New" w:hAnsi="Courier New" w:cs="Courier New"/>
+        </w:rPr>
+      </w:pPr>
+      <w:r>
+        <w:rPr>
+          <w:rFonts w:ascii="Courier New" w:hAnsi="Courier New" w:cs="Courier New"/>
+        </w:rPr>
+        <w:t># Calculate the file number from the task ID</w:t>
+      </w:r>
+    </w:p>
+    <w:p>
+      <w:pPr>
+        <w:pStyle w:val="PlainText"/>
+        <w:rPr>
+          <w:rFonts w:ascii="Courier New" w:hAnsi="Courier New" w:cs="Courier New"/>
+        </w:rPr>
+      </w:pPr>
       <w:proofErr w:type="spellStart"/>
       <w:r>
         <w:rPr>
           <w:rFonts w:ascii="Courier New" w:hAnsi="Courier New" w:cs="Courier New"/>
         </w:rPr>
-        <w:t>kkreth_umassd_edu</w:t>
+        <w:t>file_number</w:t>
       </w:r>
       <w:proofErr w:type="spellEnd"/>
       <w:r>
         <w:rPr>
           <w:rFonts w:ascii="Courier New" w:hAnsi="Courier New" w:cs="Courier New"/>
         </w:rPr>
-        <w:t>/logs/%x.%A.%</w:t>
+        <w:t>=$SLURM_ARRAY_TASK_ID</w:t>
+      </w:r>
+    </w:p>
+    <w:p>
+      <w:pPr>
+        <w:pStyle w:val="PlainText"/>
+        <w:rPr>
+          <w:rFonts w:ascii="Courier New" w:hAnsi="Courier New" w:cs="Courier New"/>
+        </w:rPr>
+      </w:pPr>
+    </w:p>
+    <w:p>
+      <w:pPr>
+        <w:pStyle w:val="PlainText"/>
+        <w:rPr>
+          <w:rFonts w:ascii="Courier New" w:hAnsi="Courier New" w:cs="Courier New"/>
+        </w:rPr>
+      </w:pPr>
+      <w:r>
+        <w:rPr>
+          <w:rFonts w:ascii="Courier New" w:hAnsi="Courier New" w:cs="Courier New"/>
+        </w:rPr>
+        <w:t># Construct the input file path</w:t>
+      </w:r>
+    </w:p>
+    <w:p>
+      <w:pPr>
+        <w:pStyle w:val="PlainText"/>
+        <w:rPr>
+          <w:rFonts w:ascii="Courier New" w:hAnsi="Courier New" w:cs="Courier New"/>
+        </w:rPr>
+      </w:pPr>
+      <w:r>
+        <w:rPr>
+          <w:rFonts w:ascii="Courier New" w:hAnsi="Courier New" w:cs="Courier New"/>
+        </w:rPr>
+        <w:t>file_1="${</w:t>
       </w:r>
       <w:proofErr w:type="spellStart"/>
       <w:r>
         <w:rPr>
           <w:rFonts w:ascii="Courier New" w:hAnsi="Courier New" w:cs="Courier New"/>
         </w:rPr>
-        <w:t>a.out</w:t>
+        <w:t>directory_path</w:t>
       </w:r>
       <w:proofErr w:type="spellEnd"/>
-    </w:p>
-    <w:p>
-      <w:pPr>
-        <w:pStyle w:val="PlainText"/>
-        <w:rPr>
-          <w:rFonts w:ascii="Courier New" w:hAnsi="Courier New" w:cs="Courier New"/>
-        </w:rPr>
-      </w:pPr>
-    </w:p>
-    <w:p>
-      <w:pPr>
-        <w:pStyle w:val="PlainText"/>
-        <w:rPr>
-          <w:rFonts w:ascii="Courier New" w:hAnsi="Courier New" w:cs="Courier New"/>
-        </w:rPr>
-      </w:pPr>
-      <w:r>
-        <w:rPr>
-          <w:rFonts w:ascii="Courier New" w:hAnsi="Courier New" w:cs="Courier New"/>
-        </w:rPr>
-        <w:t>source /home/</w:t>
+      <w:r>
+        <w:rPr>
+          <w:rFonts w:ascii="Courier New" w:hAnsi="Courier New" w:cs="Courier New"/>
+        </w:rPr>
+        <w:t>}/${</w:t>
       </w:r>
       <w:proofErr w:type="spellStart"/>
       <w:r>
         <w:rPr>
           <w:rFonts w:ascii="Courier New" w:hAnsi="Courier New" w:cs="Courier New"/>
         </w:rPr>
-        <w:t>kkreth_umassd_edu</w:t>
+        <w:t>file_number</w:t>
       </w:r>
       <w:proofErr w:type="spellEnd"/>
       <w:r>
         <w:rPr>
           <w:rFonts w:ascii="Courier New" w:hAnsi="Courier New" w:cs="Courier New"/>
         </w:rPr>
-        <w:t>/_virtual_python_2/bin/activate</w:t>
-      </w:r>
-    </w:p>
-    <w:p>
-      <w:pPr>
-        <w:pStyle w:val="PlainText"/>
-        <w:rPr>
-          <w:rFonts w:ascii="Courier New" w:hAnsi="Courier New" w:cs="Courier New"/>
-        </w:rPr>
-      </w:pPr>
-    </w:p>
-    <w:p>
-      <w:pPr>
-        <w:pStyle w:val="PlainText"/>
-        <w:rPr>
-          <w:rFonts w:ascii="Courier New" w:hAnsi="Courier New" w:cs="Courier New"/>
-        </w:rPr>
-      </w:pPr>
-      <w:r>
-        <w:rPr>
-          <w:rFonts w:ascii="Courier New" w:hAnsi="Courier New" w:cs="Courier New"/>
-        </w:rPr>
-        <w:t># Set the directory path</w:t>
-      </w:r>
-    </w:p>
-    <w:p>
-      <w:pPr>
-        <w:pStyle w:val="PlainText"/>
-        <w:rPr>
-          <w:rFonts w:ascii="Courier New" w:hAnsi="Courier New" w:cs="Courier New"/>
-        </w:rPr>
-      </w:pPr>
-      <w:r>
-        <w:rPr>
-          <w:rFonts w:ascii="Courier New" w:hAnsi="Courier New" w:cs="Courier New"/>
-        </w:rPr>
-        <w:t>export PYTHONPATH="${PYTHONPATH}:/home/kkreth_umassd_edu/cgan/production/:/home/kkreth_umassd_edu/cgan/:/home/kkreth_umassd_edu/cgan/production/encoder/"</w:t>
-      </w:r>
-    </w:p>
-    <w:p>
-      <w:pPr>
-        <w:pStyle w:val="PlainText"/>
-        <w:rPr>
-          <w:rFonts w:ascii="Courier New" w:hAnsi="Courier New" w:cs="Courier New"/>
-        </w:rPr>
-      </w:pPr>
-      <w:r>
-        <w:rPr>
-          <w:rFonts w:ascii="Courier New" w:hAnsi="Courier New" w:cs="Courier New"/>
-        </w:rPr>
-        <w:t>cd /home/</w:t>
+        <w:t>}.</w:t>
       </w:r>
       <w:proofErr w:type="spellStart"/>
       <w:r>
         <w:rPr>
           <w:rFonts w:ascii="Courier New" w:hAnsi="Courier New" w:cs="Courier New"/>
         </w:rPr>
-        <w:t>kkreth_umassd_edu</w:t>
+        <w:t>hdf</w:t>
       </w:r>
       <w:proofErr w:type="spellEnd"/>
-      <w:r>
-        <w:rPr>
-          <w:rFonts w:ascii="Courier New" w:hAnsi="Courier New" w:cs="Courier New"/>
-        </w:rPr>
-        <w:t>/</w:t>
-      </w:r>
-      <w:proofErr w:type="spellStart"/>
-      <w:r>
-        <w:rPr>
-          <w:rFonts w:ascii="Courier New" w:hAnsi="Courier New" w:cs="Courier New"/>
-        </w:rPr>
-        <w:t>cgan</w:t>
-      </w:r>
-      <w:proofErr w:type="spellEnd"/>
-      <w:r>
-        <w:rPr>
-          <w:rFonts w:ascii="Courier New" w:hAnsi="Courier New" w:cs="Courier New"/>
-        </w:rPr>
-        <w:t>/production/</w:t>
-      </w:r>
-    </w:p>
-    <w:p>
-      <w:pPr>
-        <w:pStyle w:val="PlainText"/>
-        <w:rPr>
-          <w:rFonts w:ascii="Courier New" w:hAnsi="Courier New" w:cs="Courier New"/>
-        </w:rPr>
-      </w:pPr>
-    </w:p>
-    <w:p>
-      <w:pPr>
-        <w:pStyle w:val="PlainText"/>
-        <w:rPr>
-          <w:rFonts w:ascii="Courier New" w:hAnsi="Courier New" w:cs="Courier New"/>
-        </w:rPr>
-      </w:pPr>
-      <w:r>
-        <w:rPr>
-          <w:rFonts w:ascii="Courier New" w:hAnsi="Courier New" w:cs="Courier New"/>
-        </w:rPr>
-        <w:t># Set the directory path using job name</w:t>
-      </w:r>
-    </w:p>
-    <w:p>
-      <w:pPr>
-        <w:pStyle w:val="PlainText"/>
-        <w:rPr>
-          <w:rFonts w:ascii="Courier New" w:hAnsi="Courier New" w:cs="Courier New"/>
-        </w:rPr>
-      </w:pPr>
-      <w:r>
-        <w:rPr>
-          <w:rFonts w:ascii="Courier New" w:hAnsi="Courier New" w:cs="Courier New"/>
-        </w:rPr>
-        <w:t>directory_path="/home/kkreth_umassd_edu/DL-PTV/${SLURM_JOB_NAME}"</w:t>
-      </w:r>
-    </w:p>
-    <w:p>
-      <w:pPr>
-        <w:pStyle w:val="PlainText"/>
-        <w:rPr>
-          <w:rFonts w:ascii="Courier New" w:hAnsi="Courier New" w:cs="Courier New"/>
-        </w:rPr>
-      </w:pPr>
-    </w:p>
-    <w:p>
-      <w:pPr>
-        <w:pStyle w:val="PlainText"/>
-        <w:rPr>
-          <w:rFonts w:ascii="Courier New" w:hAnsi="Courier New" w:cs="Courier New"/>
-        </w:rPr>
-      </w:pPr>
-      <w:r>
-        <w:rPr>
-          <w:rFonts w:ascii="Courier New" w:hAnsi="Courier New" w:cs="Courier New"/>
-        </w:rPr>
-        <w:t># Calculate the file number from the task ID</w:t>
-      </w:r>
-    </w:p>
-    <w:p>
-      <w:pPr>
-        <w:pStyle w:val="PlainText"/>
-        <w:rPr>
-          <w:rFonts w:ascii="Courier New" w:hAnsi="Courier New" w:cs="Courier New"/>
-        </w:rPr>
-      </w:pPr>
-      <w:proofErr w:type="spellStart"/>
-      <w:r>
-        <w:rPr>
-          <w:rFonts w:ascii="Courier New" w:hAnsi="Courier New" w:cs="Courier New"/>
-        </w:rPr>
-        <w:t>file_number</w:t>
-      </w:r>
-      <w:proofErr w:type="spellEnd"/>
-      <w:r>
-        <w:rPr>
-          <w:rFonts w:ascii="Courier New" w:hAnsi="Courier New" w:cs="Courier New"/>
-        </w:rPr>
-        <w:t>=$SLURM_ARRAY_TASK_ID</w:t>
-      </w:r>
-    </w:p>
-    <w:p>
-      <w:pPr>
-        <w:pStyle w:val="PlainText"/>
-        <w:rPr>
-          <w:rFonts w:ascii="Courier New" w:hAnsi="Courier New" w:cs="Courier New"/>
-        </w:rPr>
-      </w:pPr>
-    </w:p>
-    <w:p>
-      <w:pPr>
-        <w:pStyle w:val="PlainText"/>
-        <w:rPr>
-          <w:rFonts w:ascii="Courier New" w:hAnsi="Courier New" w:cs="Courier New"/>
-        </w:rPr>
-      </w:pPr>
-      <w:r>
-        <w:rPr>
-          <w:rFonts w:ascii="Courier New" w:hAnsi="Courier New" w:cs="Courier New"/>
-        </w:rPr>
-        <w:t># Construct the input file path</w:t>
-      </w:r>
-    </w:p>
-    <w:p>
-      <w:pPr>
-        <w:pStyle w:val="PlainText"/>
-        <w:rPr>
-          <w:rFonts w:ascii="Courier New" w:hAnsi="Courier New" w:cs="Courier New"/>
-        </w:rPr>
-      </w:pPr>
-      <w:r>
-        <w:rPr>
-          <w:rFonts w:ascii="Courier New" w:hAnsi="Courier New" w:cs="Courier New"/>
-        </w:rPr>
-        <w:t>file_1="${</w:t>
-      </w:r>
-      <w:proofErr w:type="spellStart"/>
-      <w:r>
-        <w:rPr>
-          <w:rFonts w:ascii="Courier New" w:hAnsi="Courier New" w:cs="Courier New"/>
-        </w:rPr>
-        <w:t>directory_path</w:t>
-      </w:r>
-      <w:proofErr w:type="spellEnd"/>
-      <w:r>
-        <w:rPr>
-          <w:rFonts w:ascii="Courier New" w:hAnsi="Courier New" w:cs="Courier New"/>
-        </w:rPr>
-        <w:t>}/${</w:t>
-      </w:r>
-      <w:proofErr w:type="spellStart"/>
-      <w:r>
-        <w:rPr>
-          <w:rFonts w:ascii="Courier New" w:hAnsi="Courier New" w:cs="Courier New"/>
-        </w:rPr>
-        <w:t>file_number</w:t>
-      </w:r>
-      <w:proofErr w:type="spellEnd"/>
-      <w:proofErr w:type="gramStart"/>
-      <w:r>
-        <w:rPr>
-          <w:rFonts w:ascii="Courier New" w:hAnsi="Courier New" w:cs="Courier New"/>
-        </w:rPr>
-        <w:t>}.</w:t>
-      </w:r>
-      <w:proofErr w:type="spellStart"/>
-      <w:r>
-        <w:rPr>
-          <w:rFonts w:ascii="Courier New" w:hAnsi="Courier New" w:cs="Courier New"/>
-        </w:rPr>
-        <w:t>hdf</w:t>
-      </w:r>
-      <w:proofErr w:type="spellEnd"/>
-      <w:proofErr w:type="gramEnd"/>
       <w:r>
         <w:rPr>
           <w:rFonts w:ascii="Courier New" w:hAnsi="Courier New" w:cs="Courier New"/>
@@ -2151,13 +2100,8 @@
           <w:numId w:val="9"/>
         </w:numPr>
       </w:pPr>
-      <w:proofErr w:type="gramStart"/>
-      <w:r>
-        <w:t>Additionally</w:t>
-      </w:r>
-      <w:proofErr w:type="gramEnd"/>
-      <w:r>
-        <w:t xml:space="preserve"> there is a “</w:t>
+      <w:r>
+        <w:t>Additionally there is a “</w:t>
       </w:r>
       <w:proofErr w:type="spellStart"/>
       <w:r>
@@ -2227,15 +2171,7 @@
       </w:r>
       <w:r>
         <w:br/>
-        <w:t xml:space="preserve">This is not </w:t>
-      </w:r>
-      <w:proofErr w:type="gramStart"/>
-      <w:r>
-        <w:t>ideal, and</w:t>
-      </w:r>
-      <w:proofErr w:type="gramEnd"/>
-      <w:r>
-        <w:t xml:space="preserve"> should be integer instead.</w:t>
+        <w:t>This is not ideal, and should be integer instead.</w:t>
       </w:r>
     </w:p>
     <w:p>
@@ -2282,19 +2218,11 @@
       <w:r>
         <w:br/>
       </w:r>
-      <w:proofErr w:type="gramStart"/>
-      <w:r>
-        <w:rPr>
-          <w:rFonts w:ascii="Courier New" w:hAnsi="Courier New" w:cs="Courier New"/>
-        </w:rPr>
-        <w:t>#!/</w:t>
-      </w:r>
-      <w:proofErr w:type="gramEnd"/>
-      <w:r>
-        <w:rPr>
-          <w:rFonts w:ascii="Courier New" w:hAnsi="Courier New" w:cs="Courier New"/>
-        </w:rPr>
-        <w:t>bin/bash</w:t>
+      <w:r>
+        <w:rPr>
+          <w:rFonts w:ascii="Courier New" w:hAnsi="Courier New" w:cs="Courier New"/>
+        </w:rPr>
+        <w:t>#!/bin/bash</w:t>
       </w:r>
     </w:p>
     <w:p>
@@ -2407,21 +2335,63 @@
         <w:rPr>
           <w:rFonts w:ascii="Courier New" w:hAnsi="Courier New" w:cs="Courier New"/>
         </w:rPr>
+        <w:t>#SBATCH --job-name=v0037</w:t>
+      </w:r>
+    </w:p>
+    <w:p>
+      <w:pPr>
+        <w:pStyle w:val="PlainText"/>
+        <w:rPr>
+          <w:rFonts w:ascii="Courier New" w:hAnsi="Courier New" w:cs="Courier New"/>
+        </w:rPr>
+      </w:pPr>
+      <w:r>
+        <w:rPr>
+          <w:rFonts w:ascii="Courier New" w:hAnsi="Courier New" w:cs="Courier New"/>
+        </w:rPr>
+        <w:t>#SBATCH -t 24:00:00  # Job time limit</w:t>
+      </w:r>
+    </w:p>
+    <w:p>
+      <w:pPr>
+        <w:pStyle w:val="PlainText"/>
+        <w:rPr>
+          <w:rFonts w:ascii="Courier New" w:hAnsi="Courier New" w:cs="Courier New"/>
+        </w:rPr>
+      </w:pPr>
+      <w:r>
+        <w:rPr>
+          <w:rFonts w:ascii="Courier New" w:hAnsi="Courier New" w:cs="Courier New"/>
+        </w:rPr>
+        <w:t>#SBATCH --nodes=1</w:t>
+      </w:r>
+    </w:p>
+    <w:p>
+      <w:pPr>
+        <w:pStyle w:val="PlainText"/>
+        <w:rPr>
+          <w:rFonts w:ascii="Courier New" w:hAnsi="Courier New" w:cs="Courier New"/>
+        </w:rPr>
+      </w:pPr>
+      <w:r>
+        <w:rPr>
+          <w:rFonts w:ascii="Courier New" w:hAnsi="Courier New" w:cs="Courier New"/>
+        </w:rPr>
         <w:t>#SBATCH --</w:t>
       </w:r>
-      <w:proofErr w:type="gramStart"/>
-      <w:r>
-        <w:rPr>
-          <w:rFonts w:ascii="Courier New" w:hAnsi="Courier New" w:cs="Courier New"/>
-        </w:rPr>
-        <w:t>job-name</w:t>
-      </w:r>
-      <w:proofErr w:type="gramEnd"/>
-      <w:r>
-        <w:rPr>
-          <w:rFonts w:ascii="Courier New" w:hAnsi="Courier New" w:cs="Courier New"/>
-        </w:rPr>
-        <w:t>=v0037</w:t>
+      <w:proofErr w:type="spellStart"/>
+      <w:r>
+        <w:rPr>
+          <w:rFonts w:ascii="Courier New" w:hAnsi="Courier New" w:cs="Courier New"/>
+        </w:rPr>
+        <w:t>ntasks</w:t>
+      </w:r>
+      <w:proofErr w:type="spellEnd"/>
+      <w:r>
+        <w:rPr>
+          <w:rFonts w:ascii="Courier New" w:hAnsi="Courier New" w:cs="Courier New"/>
+        </w:rPr>
+        <w:t>-per-node=1</w:t>
       </w:r>
     </w:p>
     <w:p>
@@ -2435,21 +2405,21 @@
         <w:rPr>
           <w:rFonts w:ascii="Courier New" w:hAnsi="Courier New" w:cs="Courier New"/>
         </w:rPr>
-        <w:t xml:space="preserve">#SBATCH -t </w:t>
-      </w:r>
-      <w:proofErr w:type="gramStart"/>
-      <w:r>
-        <w:rPr>
-          <w:rFonts w:ascii="Courier New" w:hAnsi="Courier New" w:cs="Courier New"/>
-        </w:rPr>
-        <w:t>24:00:00  #</w:t>
-      </w:r>
-      <w:proofErr w:type="gramEnd"/>
-      <w:r>
-        <w:rPr>
-          <w:rFonts w:ascii="Courier New" w:hAnsi="Courier New" w:cs="Courier New"/>
-        </w:rPr>
-        <w:t xml:space="preserve"> Job time limit</w:t>
+        <w:t>#SBATCH --output=/home/</w:t>
+      </w:r>
+      <w:proofErr w:type="spellStart"/>
+      <w:r>
+        <w:rPr>
+          <w:rFonts w:ascii="Courier New" w:hAnsi="Courier New" w:cs="Courier New"/>
+        </w:rPr>
+        <w:t>kkreth_umassd_edu</w:t>
+      </w:r>
+      <w:proofErr w:type="spellEnd"/>
+      <w:r>
+        <w:rPr>
+          <w:rFonts w:ascii="Courier New" w:hAnsi="Courier New" w:cs="Courier New"/>
+        </w:rPr>
+        <w:t>/logs/WAE4_out.log</w:t>
       </w:r>
     </w:p>
     <w:p>
@@ -2463,7 +2433,21 @@
         <w:rPr>
           <w:rFonts w:ascii="Courier New" w:hAnsi="Courier New" w:cs="Courier New"/>
         </w:rPr>
-        <w:t>#SBATCH --nodes=1</w:t>
+        <w:t>#SBATCH --error=/home/</w:t>
+      </w:r>
+      <w:proofErr w:type="spellStart"/>
+      <w:r>
+        <w:rPr>
+          <w:rFonts w:ascii="Courier New" w:hAnsi="Courier New" w:cs="Courier New"/>
+        </w:rPr>
+        <w:t>kkreth_umassd_edu</w:t>
+      </w:r>
+      <w:proofErr w:type="spellEnd"/>
+      <w:r>
+        <w:rPr>
+          <w:rFonts w:ascii="Courier New" w:hAnsi="Courier New" w:cs="Courier New"/>
+        </w:rPr>
+        <w:t>/logs/WAE4_err.log</w:t>
       </w:r>
     </w:p>
     <w:p>
@@ -2473,25 +2457,33 @@
           <w:rFonts w:ascii="Courier New" w:hAnsi="Courier New" w:cs="Courier New"/>
         </w:rPr>
       </w:pPr>
-      <w:r>
-        <w:rPr>
-          <w:rFonts w:ascii="Courier New" w:hAnsi="Courier New" w:cs="Courier New"/>
-        </w:rPr>
-        <w:t>#SBATCH --</w:t>
+    </w:p>
+    <w:p>
+      <w:pPr>
+        <w:pStyle w:val="PlainText"/>
+        <w:rPr>
+          <w:rFonts w:ascii="Courier New" w:hAnsi="Courier New" w:cs="Courier New"/>
+        </w:rPr>
+      </w:pPr>
+      <w:r>
+        <w:rPr>
+          <w:rFonts w:ascii="Courier New" w:hAnsi="Courier New" w:cs="Courier New"/>
+        </w:rPr>
+        <w:t>source /home/</w:t>
       </w:r>
       <w:proofErr w:type="spellStart"/>
       <w:r>
         <w:rPr>
           <w:rFonts w:ascii="Courier New" w:hAnsi="Courier New" w:cs="Courier New"/>
         </w:rPr>
-        <w:t>ntasks</w:t>
+        <w:t>kkreth_umassd_edu</w:t>
       </w:r>
       <w:proofErr w:type="spellEnd"/>
       <w:r>
         <w:rPr>
           <w:rFonts w:ascii="Courier New" w:hAnsi="Courier New" w:cs="Courier New"/>
         </w:rPr>
-        <w:t>-per-node=1</w:t>
+        <w:t>/_virtual_python_2/bin/activate</w:t>
       </w:r>
     </w:p>
     <w:p>
@@ -2501,17 +2493,47 @@
           <w:rFonts w:ascii="Courier New" w:hAnsi="Courier New" w:cs="Courier New"/>
         </w:rPr>
       </w:pPr>
-      <w:r>
-        <w:rPr>
-          <w:rFonts w:ascii="Courier New" w:hAnsi="Courier New" w:cs="Courier New"/>
-        </w:rPr>
-        <w:t>#SBATCH --output=/home/</w:t>
-      </w:r>
+    </w:p>
+    <w:p>
+      <w:pPr>
+        <w:pStyle w:val="PlainText"/>
+        <w:rPr>
+          <w:rFonts w:ascii="Courier New" w:hAnsi="Courier New" w:cs="Courier New"/>
+        </w:rPr>
+      </w:pPr>
+      <w:r>
+        <w:rPr>
+          <w:rFonts w:ascii="Courier New" w:hAnsi="Courier New" w:cs="Courier New"/>
+        </w:rPr>
+        <w:t># Set the directory path</w:t>
+      </w:r>
+    </w:p>
+    <w:p>
+      <w:pPr>
+        <w:pStyle w:val="PlainText"/>
+        <w:rPr>
+          <w:rFonts w:ascii="Courier New" w:hAnsi="Courier New" w:cs="Courier New"/>
+        </w:rPr>
+      </w:pPr>
       <w:proofErr w:type="spellStart"/>
       <w:r>
         <w:rPr>
           <w:rFonts w:ascii="Courier New" w:hAnsi="Courier New" w:cs="Courier New"/>
         </w:rPr>
+        <w:t>directory_path</w:t>
+      </w:r>
+      <w:proofErr w:type="spellEnd"/>
+      <w:r>
+        <w:rPr>
+          <w:rFonts w:ascii="Courier New" w:hAnsi="Courier New" w:cs="Courier New"/>
+        </w:rPr>
+        <w:t>="/home/</w:t>
+      </w:r>
+      <w:proofErr w:type="spellStart"/>
+      <w:r>
+        <w:rPr>
+          <w:rFonts w:ascii="Courier New" w:hAnsi="Courier New" w:cs="Courier New"/>
+        </w:rPr>
         <w:t>kkreth_umassd_edu</w:t>
       </w:r>
       <w:proofErr w:type="spellEnd"/>
@@ -2519,7 +2541,21 @@
         <w:rPr>
           <w:rFonts w:ascii="Courier New" w:hAnsi="Courier New" w:cs="Courier New"/>
         </w:rPr>
-        <w:t>/logs/WAE4_out.log</w:t>
+        <w:t>/</w:t>
+      </w:r>
+      <w:proofErr w:type="spellStart"/>
+      <w:r>
+        <w:rPr>
+          <w:rFonts w:ascii="Courier New" w:hAnsi="Courier New" w:cs="Courier New"/>
+        </w:rPr>
+        <w:t>cgan</w:t>
+      </w:r>
+      <w:proofErr w:type="spellEnd"/>
+      <w:r>
+        <w:rPr>
+          <w:rFonts w:ascii="Courier New" w:hAnsi="Courier New" w:cs="Courier New"/>
+        </w:rPr>
+        <w:t>/production/encoder"</w:t>
       </w:r>
     </w:p>
     <w:p>
@@ -2529,11 +2565,41 @@
           <w:rFonts w:ascii="Courier New" w:hAnsi="Courier New" w:cs="Courier New"/>
         </w:rPr>
       </w:pPr>
-      <w:r>
-        <w:rPr>
-          <w:rFonts w:ascii="Courier New" w:hAnsi="Courier New" w:cs="Courier New"/>
-        </w:rPr>
-        <w:t>#SBATCH --error=/home/</w:t>
+    </w:p>
+    <w:p>
+      <w:pPr>
+        <w:pStyle w:val="PlainText"/>
+        <w:rPr>
+          <w:rFonts w:ascii="Courier New" w:hAnsi="Courier New" w:cs="Courier New"/>
+        </w:rPr>
+      </w:pPr>
+    </w:p>
+    <w:p>
+      <w:pPr>
+        <w:pStyle w:val="PlainText"/>
+        <w:rPr>
+          <w:rFonts w:ascii="Courier New" w:hAnsi="Courier New" w:cs="Courier New"/>
+        </w:rPr>
+      </w:pPr>
+      <w:r>
+        <w:rPr>
+          <w:rFonts w:ascii="Courier New" w:hAnsi="Courier New" w:cs="Courier New"/>
+        </w:rPr>
+        <w:t># Pass the input file as an argument to the Python script</w:t>
+      </w:r>
+    </w:p>
+    <w:p>
+      <w:pPr>
+        <w:pStyle w:val="PlainText"/>
+        <w:rPr>
+          <w:rFonts w:ascii="Courier New" w:hAnsi="Courier New" w:cs="Courier New"/>
+        </w:rPr>
+      </w:pPr>
+      <w:r>
+        <w:rPr>
+          <w:rFonts w:ascii="Courier New" w:hAnsi="Courier New" w:cs="Courier New"/>
+        </w:rPr>
+        <w:t>/home/</w:t>
       </w:r>
       <w:proofErr w:type="spellStart"/>
       <w:r>
@@ -2547,172 +2613,6 @@
         <w:rPr>
           <w:rFonts w:ascii="Courier New" w:hAnsi="Courier New" w:cs="Courier New"/>
         </w:rPr>
-        <w:t>/logs/WAE4_err.log</w:t>
-      </w:r>
-    </w:p>
-    <w:p>
-      <w:pPr>
-        <w:pStyle w:val="PlainText"/>
-        <w:rPr>
-          <w:rFonts w:ascii="Courier New" w:hAnsi="Courier New" w:cs="Courier New"/>
-        </w:rPr>
-      </w:pPr>
-    </w:p>
-    <w:p>
-      <w:pPr>
-        <w:pStyle w:val="PlainText"/>
-        <w:rPr>
-          <w:rFonts w:ascii="Courier New" w:hAnsi="Courier New" w:cs="Courier New"/>
-        </w:rPr>
-      </w:pPr>
-      <w:r>
-        <w:rPr>
-          <w:rFonts w:ascii="Courier New" w:hAnsi="Courier New" w:cs="Courier New"/>
-        </w:rPr>
-        <w:t>source /home/</w:t>
-      </w:r>
-      <w:proofErr w:type="spellStart"/>
-      <w:r>
-        <w:rPr>
-          <w:rFonts w:ascii="Courier New" w:hAnsi="Courier New" w:cs="Courier New"/>
-        </w:rPr>
-        <w:t>kkreth_umassd_edu</w:t>
-      </w:r>
-      <w:proofErr w:type="spellEnd"/>
-      <w:r>
-        <w:rPr>
-          <w:rFonts w:ascii="Courier New" w:hAnsi="Courier New" w:cs="Courier New"/>
-        </w:rPr>
-        <w:t>/_virtual_python_2/bin/activate</w:t>
-      </w:r>
-    </w:p>
-    <w:p>
-      <w:pPr>
-        <w:pStyle w:val="PlainText"/>
-        <w:rPr>
-          <w:rFonts w:ascii="Courier New" w:hAnsi="Courier New" w:cs="Courier New"/>
-        </w:rPr>
-      </w:pPr>
-    </w:p>
-    <w:p>
-      <w:pPr>
-        <w:pStyle w:val="PlainText"/>
-        <w:rPr>
-          <w:rFonts w:ascii="Courier New" w:hAnsi="Courier New" w:cs="Courier New"/>
-        </w:rPr>
-      </w:pPr>
-      <w:r>
-        <w:rPr>
-          <w:rFonts w:ascii="Courier New" w:hAnsi="Courier New" w:cs="Courier New"/>
-        </w:rPr>
-        <w:t># Set the directory path</w:t>
-      </w:r>
-    </w:p>
-    <w:p>
-      <w:pPr>
-        <w:pStyle w:val="PlainText"/>
-        <w:rPr>
-          <w:rFonts w:ascii="Courier New" w:hAnsi="Courier New" w:cs="Courier New"/>
-        </w:rPr>
-      </w:pPr>
-      <w:proofErr w:type="spellStart"/>
-      <w:r>
-        <w:rPr>
-          <w:rFonts w:ascii="Courier New" w:hAnsi="Courier New" w:cs="Courier New"/>
-        </w:rPr>
-        <w:t>directory_path</w:t>
-      </w:r>
-      <w:proofErr w:type="spellEnd"/>
-      <w:r>
-        <w:rPr>
-          <w:rFonts w:ascii="Courier New" w:hAnsi="Courier New" w:cs="Courier New"/>
-        </w:rPr>
-        <w:t>="/home/</w:t>
-      </w:r>
-      <w:proofErr w:type="spellStart"/>
-      <w:r>
-        <w:rPr>
-          <w:rFonts w:ascii="Courier New" w:hAnsi="Courier New" w:cs="Courier New"/>
-        </w:rPr>
-        <w:t>kkreth_umassd_edu</w:t>
-      </w:r>
-      <w:proofErr w:type="spellEnd"/>
-      <w:r>
-        <w:rPr>
-          <w:rFonts w:ascii="Courier New" w:hAnsi="Courier New" w:cs="Courier New"/>
-        </w:rPr>
-        <w:t>/</w:t>
-      </w:r>
-      <w:proofErr w:type="spellStart"/>
-      <w:r>
-        <w:rPr>
-          <w:rFonts w:ascii="Courier New" w:hAnsi="Courier New" w:cs="Courier New"/>
-        </w:rPr>
-        <w:t>cgan</w:t>
-      </w:r>
-      <w:proofErr w:type="spellEnd"/>
-      <w:r>
-        <w:rPr>
-          <w:rFonts w:ascii="Courier New" w:hAnsi="Courier New" w:cs="Courier New"/>
-        </w:rPr>
-        <w:t>/production/encoder"</w:t>
-      </w:r>
-    </w:p>
-    <w:p>
-      <w:pPr>
-        <w:pStyle w:val="PlainText"/>
-        <w:rPr>
-          <w:rFonts w:ascii="Courier New" w:hAnsi="Courier New" w:cs="Courier New"/>
-        </w:rPr>
-      </w:pPr>
-    </w:p>
-    <w:p>
-      <w:pPr>
-        <w:pStyle w:val="PlainText"/>
-        <w:rPr>
-          <w:rFonts w:ascii="Courier New" w:hAnsi="Courier New" w:cs="Courier New"/>
-        </w:rPr>
-      </w:pPr>
-    </w:p>
-    <w:p>
-      <w:pPr>
-        <w:pStyle w:val="PlainText"/>
-        <w:rPr>
-          <w:rFonts w:ascii="Courier New" w:hAnsi="Courier New" w:cs="Courier New"/>
-        </w:rPr>
-      </w:pPr>
-      <w:r>
-        <w:rPr>
-          <w:rFonts w:ascii="Courier New" w:hAnsi="Courier New" w:cs="Courier New"/>
-        </w:rPr>
-        <w:t># Pass the input file as an argument to the Python script</w:t>
-      </w:r>
-    </w:p>
-    <w:p>
-      <w:pPr>
-        <w:pStyle w:val="PlainText"/>
-        <w:rPr>
-          <w:rFonts w:ascii="Courier New" w:hAnsi="Courier New" w:cs="Courier New"/>
-        </w:rPr>
-      </w:pPr>
-      <w:r>
-        <w:rPr>
-          <w:rFonts w:ascii="Courier New" w:hAnsi="Courier New" w:cs="Courier New"/>
-        </w:rPr>
-        <w:t>/home/</w:t>
-      </w:r>
-      <w:proofErr w:type="spellStart"/>
-      <w:r>
-        <w:rPr>
-          <w:rFonts w:ascii="Courier New" w:hAnsi="Courier New" w:cs="Courier New"/>
-        </w:rPr>
-        <w:t>kkreth_umassd_edu</w:t>
-      </w:r>
-      <w:proofErr w:type="spellEnd"/>
-      <w:r>
-        <w:rPr>
-          <w:rFonts w:ascii="Courier New" w:hAnsi="Courier New" w:cs="Courier New"/>
-        </w:rPr>
         <w:t>/_virtual_python_2/bin/python /home/kkreth_umassd_edu/cgan/production/encoder/train.py</w:t>
       </w:r>
     </w:p>
@@ -2774,13 +2674,8 @@
         </w:rPr>
         <w:t>9</w:t>
       </w:r>
-      <w:proofErr w:type="gramStart"/>
-      <w:r>
-        <w:t>….ah</w:t>
-      </w:r>
-      <w:proofErr w:type="gramEnd"/>
-      <w:r>
-        <w:t>…the days of the GPU have finally arrived!</w:t>
+      <w:r>
+        <w:t>….ah…the days of the GPU have finally arrived!</w:t>
       </w:r>
     </w:p>
     <w:p>
@@ -2844,15 +2739,7 @@
       </w:r>
       <w:proofErr w:type="spellEnd"/>
       <w:r>
-        <w:t xml:space="preserve"> etc. So, if you peak in the </w:t>
-      </w:r>
-      <w:proofErr w:type="gramStart"/>
-      <w:r>
-        <w:t>file</w:t>
-      </w:r>
-      <w:proofErr w:type="gramEnd"/>
-      <w:r>
-        <w:t xml:space="preserve"> it is literally:</w:t>
+        <w:t xml:space="preserve"> etc. So, if you peak in the file it is literally:</w:t>
       </w:r>
       <w:r>
         <w:br/>
@@ -3055,15 +2942,7 @@
         <w:t>The order</w:t>
       </w:r>
       <w:r>
-        <w:t xml:space="preserve"> shouldn’t </w:t>
-      </w:r>
-      <w:proofErr w:type="gramStart"/>
-      <w:r>
-        <w:t>actually be</w:t>
-      </w:r>
-      <w:proofErr w:type="gramEnd"/>
-      <w:r>
-        <w:t xml:space="preserve"> important…but DOES have to be consistent.</w:t>
+        <w:t xml:space="preserve"> shouldn’t actually be important…but DOES have to be consistent.</w:t>
       </w:r>
     </w:p>
     <w:p>
@@ -3255,21 +3134,8 @@
           <w:numId w:val="13"/>
         </w:numPr>
       </w:pPr>
-      <w:proofErr w:type="gramStart"/>
-      <w:r>
-        <w:t>In order to</w:t>
-      </w:r>
-      <w:proofErr w:type="gramEnd"/>
-      <w:r>
-        <w:t xml:space="preserve"> help make the two different </w:t>
-      </w:r>
-      <w:proofErr w:type="gramStart"/>
-      <w:r>
-        <w:t>code-bases</w:t>
-      </w:r>
-      <w:proofErr w:type="gramEnd"/>
-      <w:r>
-        <w:t xml:space="preserve"> more “independent” and not requiring anyone to run my code besides me…I provided</w:t>
+      <w:r>
+        <w:t>In order to help make the two different code-bases more “independent” and not requiring anyone to run my code besides me…I provided</w:t>
       </w:r>
       <w:r>
         <w:t xml:space="preserve"> the precomputed “input” of all (valid) possible input cubes for all experiments, all times (</w:t>
@@ -3485,54 +3351,10 @@
           <w:highlight w:val="green"/>
         </w:rPr>
         <w:lastRenderedPageBreak/>
-        <w:t xml:space="preserve">model in </w:t>
-      </w:r>
-      <w:proofErr w:type="gramStart"/>
-      <w:r>
-        <w:rPr>
-          <w:highlight w:val="green"/>
-        </w:rPr>
-        <w:t>“.eval</w:t>
-      </w:r>
-      <w:proofErr w:type="gramEnd"/>
-      <w:r>
-        <w:rPr>
-          <w:highlight w:val="green"/>
-        </w:rPr>
-        <w:t xml:space="preserve">()” mode (do NOT forget this…it is easy to miss) rather than </w:t>
-      </w:r>
-      <w:proofErr w:type="gramStart"/>
-      <w:r>
-        <w:rPr>
-          <w:highlight w:val="green"/>
-        </w:rPr>
-        <w:t>“.train</w:t>
-      </w:r>
-      <w:proofErr w:type="gramEnd"/>
-      <w:r>
-        <w:rPr>
-          <w:highlight w:val="green"/>
-        </w:rPr>
-        <w:t>()” mode.</w:t>
-      </w:r>
-      <w:r>
-        <w:t xml:space="preserve"> </w:t>
-      </w:r>
-      <w:proofErr w:type="gramStart"/>
-      <w:r>
-        <w:t>Last but not least</w:t>
-      </w:r>
-      <w:proofErr w:type="gramEnd"/>
-      <w:r>
-        <w:t xml:space="preserve">, to get the most accurate (and with no need for conversion(s) loss measurement we want to be in the same value space/range as the original input data, that is why we reverse </w:t>
-      </w:r>
-      <w:proofErr w:type="gramStart"/>
-      <w:r>
-        <w:t>all of</w:t>
-      </w:r>
-      <w:proofErr w:type="gramEnd"/>
-      <w:r>
-        <w:t xml:space="preserve"> these steps.</w:t>
+        <w:t>model in “.eval()” mode (do NOT forget this…it is easy to miss) rather than “.train()” mode.</w:t>
+      </w:r>
+      <w:r>
+        <w:t xml:space="preserve"> Last but not least, to get the most accurate (and with no need for conversion(s) loss measurement we want to be in the same value space/range as the original input data, that is why we reverse all of these steps.</w:t>
       </w:r>
       <w:r>
         <w:t xml:space="preserve"> Because, once done, the MSE is just simply the MSE.</w:t>
@@ -3650,7 +3472,6 @@
         <w:br/>
       </w:r>
       <w:proofErr w:type="spellStart"/>
-      <w:proofErr w:type="gramStart"/>
       <w:r>
         <w:rPr>
           <w:rFonts w:ascii="Courier New" w:eastAsia="Times New Roman" w:hAnsi="Courier New" w:cs="Courier New"/>
@@ -3659,9 +3480,9 @@
           <w:szCs w:val="20"/>
           <w:lang w:eastAsia="en-US"/>
         </w:rPr>
-        <w:t>WARNING:_</w:t>
-      </w:r>
-      <w:proofErr w:type="gramEnd"/>
+        <w:t>WARNING:__main__:Found</w:t>
+      </w:r>
+      <w:proofErr w:type="spellEnd"/>
       <w:r>
         <w:rPr>
           <w:rFonts w:ascii="Courier New" w:eastAsia="Times New Roman" w:hAnsi="Courier New" w:cs="Courier New"/>
@@ -3670,9 +3491,8 @@
           <w:szCs w:val="20"/>
           <w:lang w:eastAsia="en-US"/>
         </w:rPr>
-        <w:t>_main_</w:t>
-      </w:r>
-      <w:proofErr w:type="gramStart"/>
+        <w:t xml:space="preserve"> 0 matches for coordinate (-125, 87, -33) at time 262</w:t>
+      </w:r>
       <w:r>
         <w:rPr>
           <w:rFonts w:ascii="Courier New" w:eastAsia="Times New Roman" w:hAnsi="Courier New" w:cs="Courier New"/>
@@ -3681,10 +3501,9 @@
           <w:szCs w:val="20"/>
           <w:lang w:eastAsia="en-US"/>
         </w:rPr>
-        <w:t>_:Found</w:t>
-      </w:r>
-      <w:proofErr w:type="spellEnd"/>
-      <w:proofErr w:type="gramEnd"/>
+        <w:br/>
+      </w:r>
+      <w:proofErr w:type="spellStart"/>
       <w:r>
         <w:rPr>
           <w:rFonts w:ascii="Courier New" w:eastAsia="Times New Roman" w:hAnsi="Courier New" w:cs="Courier New"/>
@@ -3693,8 +3512,9 @@
           <w:szCs w:val="20"/>
           <w:lang w:eastAsia="en-US"/>
         </w:rPr>
-        <w:t xml:space="preserve"> 0 matches for coordinate (-125, 87, -33) at time 262</w:t>
-      </w:r>
+        <w:t>WARNING:__main__:Found</w:t>
+      </w:r>
+      <w:proofErr w:type="spellEnd"/>
       <w:r>
         <w:rPr>
           <w:rFonts w:ascii="Courier New" w:eastAsia="Times New Roman" w:hAnsi="Courier New" w:cs="Courier New"/>
@@ -3703,10 +3523,8 @@
           <w:szCs w:val="20"/>
           <w:lang w:eastAsia="en-US"/>
         </w:rPr>
-        <w:br/>
-      </w:r>
-      <w:proofErr w:type="spellStart"/>
-      <w:proofErr w:type="gramStart"/>
+        <w:t xml:space="preserve"> 0 matches for coordinate (-121, 87, -33) at time 262</w:t>
+      </w:r>
       <w:r>
         <w:rPr>
           <w:rFonts w:ascii="Courier New" w:eastAsia="Times New Roman" w:hAnsi="Courier New" w:cs="Courier New"/>
@@ -3715,9 +3533,8 @@
           <w:szCs w:val="20"/>
           <w:lang w:eastAsia="en-US"/>
         </w:rPr>
-        <w:t>WARNING:_</w:t>
-      </w:r>
-      <w:proofErr w:type="gramEnd"/>
+        <w:br/>
+      </w:r>
       <w:r>
         <w:rPr>
           <w:rFonts w:ascii="Courier New" w:eastAsia="Times New Roman" w:hAnsi="Courier New" w:cs="Courier New"/>
@@ -3726,9 +3543,9 @@
           <w:szCs w:val="20"/>
           <w:lang w:eastAsia="en-US"/>
         </w:rPr>
-        <w:t>_main_</w:t>
-      </w:r>
-      <w:proofErr w:type="gramStart"/>
+        <w:br/>
+        <w:t xml:space="preserve">This happens for different times and/or coordinates on different files. </w:t>
+      </w:r>
       <w:r>
         <w:rPr>
           <w:rFonts w:ascii="Courier New" w:eastAsia="Times New Roman" w:hAnsi="Courier New" w:cs="Courier New"/>
@@ -3737,10 +3554,8 @@
           <w:szCs w:val="20"/>
           <w:lang w:eastAsia="en-US"/>
         </w:rPr>
-        <w:t>_:Found</w:t>
-      </w:r>
-      <w:proofErr w:type="spellEnd"/>
-      <w:proofErr w:type="gramEnd"/>
+        <w:br/>
+      </w:r>
       <w:r>
         <w:rPr>
           <w:rFonts w:ascii="Courier New" w:eastAsia="Times New Roman" w:hAnsi="Courier New" w:cs="Courier New"/>
@@ -3749,7 +3564,8 @@
           <w:szCs w:val="20"/>
           <w:lang w:eastAsia="en-US"/>
         </w:rPr>
-        <w:t xml:space="preserve"> 0 matches for coordinate (-121, 87, -33) at time 262</w:t>
+        <w:br/>
+        <w:t>The above was for:</w:t>
       </w:r>
       <w:r>
         <w:rPr>
@@ -3761,6 +3577,7 @@
         </w:rPr>
         <w:br/>
       </w:r>
+      <w:proofErr w:type="spellStart"/>
       <w:r>
         <w:rPr>
           <w:rFonts w:ascii="Courier New" w:eastAsia="Times New Roman" w:hAnsi="Courier New" w:cs="Courier New"/>
@@ -3769,9 +3586,9 @@
           <w:szCs w:val="20"/>
           <w:lang w:eastAsia="en-US"/>
         </w:rPr>
-        <w:br/>
-        <w:t xml:space="preserve">This happens for different times and/or coordinates on different files. </w:t>
-      </w:r>
+        <w:t>INFO:__main__:Processing</w:t>
+      </w:r>
+      <w:proofErr w:type="spellEnd"/>
       <w:r>
         <w:rPr>
           <w:rFonts w:ascii="Courier New" w:eastAsia="Times New Roman" w:hAnsi="Courier New" w:cs="Courier New"/>
@@ -3780,7 +3597,7 @@
           <w:szCs w:val="20"/>
           <w:lang w:eastAsia="en-US"/>
         </w:rPr>
-        <w:br/>
+        <w:t xml:space="preserve"> 5 rows from 10p4.pkl</w:t>
       </w:r>
       <w:r>
         <w:rPr>
@@ -3791,8 +3608,8 @@
           <w:lang w:eastAsia="en-US"/>
         </w:rPr>
         <w:br/>
-        <w:t>The above was for:</w:t>
-      </w:r>
+      </w:r>
+      <w:proofErr w:type="spellStart"/>
       <w:r>
         <w:rPr>
           <w:rFonts w:ascii="Courier New" w:eastAsia="Times New Roman" w:hAnsi="Courier New" w:cs="Courier New"/>
@@ -3801,9 +3618,9 @@
           <w:szCs w:val="20"/>
           <w:lang w:eastAsia="en-US"/>
         </w:rPr>
-        <w:br/>
-      </w:r>
-      <w:proofErr w:type="spellStart"/>
+        <w:t>INFO:__main__:Processing</w:t>
+      </w:r>
+      <w:proofErr w:type="spellEnd"/>
       <w:r>
         <w:rPr>
           <w:rFonts w:ascii="Courier New" w:eastAsia="Times New Roman" w:hAnsi="Courier New" w:cs="Courier New"/>
@@ -3812,9 +3629,8 @@
           <w:szCs w:val="20"/>
           <w:lang w:eastAsia="en-US"/>
         </w:rPr>
-        <w:t>INFO:__main__:Processing</w:t>
-      </w:r>
-      <w:proofErr w:type="spellEnd"/>
+        <w:t xml:space="preserve"> row 1/5 in 10p4.pkl</w:t>
+      </w:r>
       <w:r>
         <w:rPr>
           <w:rFonts w:ascii="Courier New" w:eastAsia="Times New Roman" w:hAnsi="Courier New" w:cs="Courier New"/>
@@ -3823,7 +3639,7 @@
           <w:szCs w:val="20"/>
           <w:lang w:eastAsia="en-US"/>
         </w:rPr>
-        <w:t xml:space="preserve"> 5 rows from 10p4.pkl</w:t>
+        <w:br/>
       </w:r>
       <w:r>
         <w:rPr>
@@ -3834,8 +3650,8 @@
           <w:lang w:eastAsia="en-US"/>
         </w:rPr>
         <w:br/>
-      </w:r>
-      <w:proofErr w:type="spellStart"/>
+        <w:t>or there is:</w:t>
+      </w:r>
       <w:r>
         <w:rPr>
           <w:rFonts w:ascii="Courier New" w:eastAsia="Times New Roman" w:hAnsi="Courier New" w:cs="Courier New"/>
@@ -3844,9 +3660,9 @@
           <w:szCs w:val="20"/>
           <w:lang w:eastAsia="en-US"/>
         </w:rPr>
-        <w:t>INFO:__main__:Processing</w:t>
-      </w:r>
-      <w:proofErr w:type="spellEnd"/>
+        <w:br/>
+      </w:r>
+      <w:proofErr w:type="spellStart"/>
       <w:r>
         <w:rPr>
           <w:rFonts w:ascii="Courier New" w:eastAsia="Times New Roman" w:hAnsi="Courier New" w:cs="Courier New"/>
@@ -3855,8 +3671,9 @@
           <w:szCs w:val="20"/>
           <w:lang w:eastAsia="en-US"/>
         </w:rPr>
-        <w:t xml:space="preserve"> row 1/5 in 10p4.pkl</w:t>
-      </w:r>
+        <w:t>DEBUG:CoordinateSpace:Point</w:t>
+      </w:r>
+      <w:proofErr w:type="spellEnd"/>
       <w:r>
         <w:rPr>
           <w:rFonts w:ascii="Courier New" w:eastAsia="Times New Roman" w:hAnsi="Courier New" w:cs="Courier New"/>
@@ -3865,7 +3682,7 @@
           <w:szCs w:val="20"/>
           <w:lang w:eastAsia="en-US"/>
         </w:rPr>
-        <w:br/>
+        <w:t xml:space="preserve"> 125/125: (-105, 87, -17)</w:t>
       </w:r>
       <w:r>
         <w:rPr>
@@ -3876,8 +3693,8 @@
           <w:lang w:eastAsia="en-US"/>
         </w:rPr>
         <w:br/>
-        <w:t>or there is:</w:t>
-      </w:r>
+      </w:r>
+      <w:proofErr w:type="spellStart"/>
       <w:r>
         <w:rPr>
           <w:rFonts w:ascii="Courier New" w:eastAsia="Times New Roman" w:hAnsi="Courier New" w:cs="Courier New"/>
@@ -3886,9 +3703,9 @@
           <w:szCs w:val="20"/>
           <w:lang w:eastAsia="en-US"/>
         </w:rPr>
-        <w:br/>
-      </w:r>
-      <w:proofErr w:type="spellStart"/>
+        <w:t>WARNING:__main__:Found</w:t>
+      </w:r>
+      <w:proofErr w:type="spellEnd"/>
       <w:r>
         <w:rPr>
           <w:rFonts w:ascii="Courier New" w:eastAsia="Times New Roman" w:hAnsi="Courier New" w:cs="Courier New"/>
@@ -3897,9 +3714,8 @@
           <w:szCs w:val="20"/>
           <w:lang w:eastAsia="en-US"/>
         </w:rPr>
-        <w:t>DEBUG:CoordinateSpace:Point</w:t>
-      </w:r>
-      <w:proofErr w:type="spellEnd"/>
+        <w:t xml:space="preserve"> 0 matches for coordinate (-121, 87, -33) at time 135</w:t>
+      </w:r>
       <w:r>
         <w:rPr>
           <w:rFonts w:ascii="Courier New" w:eastAsia="Times New Roman" w:hAnsi="Courier New" w:cs="Courier New"/>
@@ -3908,7 +3724,7 @@
           <w:szCs w:val="20"/>
           <w:lang w:eastAsia="en-US"/>
         </w:rPr>
-        <w:t xml:space="preserve"> 125/125: (-105, 87, -17)</w:t>
+        <w:br/>
       </w:r>
       <w:r>
         <w:rPr>
@@ -3919,8 +3735,8 @@
           <w:lang w:eastAsia="en-US"/>
         </w:rPr>
         <w:br/>
-      </w:r>
-      <w:proofErr w:type="spellStart"/>
+        <w:t>Which was for:</w:t>
+      </w:r>
       <w:r>
         <w:rPr>
           <w:rFonts w:ascii="Courier New" w:eastAsia="Times New Roman" w:hAnsi="Courier New" w:cs="Courier New"/>
@@ -3929,9 +3745,9 @@
           <w:szCs w:val="20"/>
           <w:lang w:eastAsia="en-US"/>
         </w:rPr>
-        <w:t>WARNING:__main__:Found</w:t>
-      </w:r>
-      <w:proofErr w:type="spellEnd"/>
+        <w:br/>
+      </w:r>
+      <w:proofErr w:type="spellStart"/>
       <w:r>
         <w:rPr>
           <w:rFonts w:ascii="Courier New" w:eastAsia="Times New Roman" w:hAnsi="Courier New" w:cs="Courier New"/>
@@ -3940,8 +3756,9 @@
           <w:szCs w:val="20"/>
           <w:lang w:eastAsia="en-US"/>
         </w:rPr>
-        <w:t xml:space="preserve"> 0 matches for coordinate (-121, 87, -33) at time 135</w:t>
-      </w:r>
+        <w:t>INFO:__main__:Processed</w:t>
+      </w:r>
+      <w:proofErr w:type="spellEnd"/>
       <w:r>
         <w:rPr>
           <w:rFonts w:ascii="Courier New" w:eastAsia="Times New Roman" w:hAnsi="Courier New" w:cs="Courier New"/>
@@ -3950,7 +3767,7 @@
           <w:szCs w:val="20"/>
           <w:lang w:eastAsia="en-US"/>
         </w:rPr>
-        <w:br/>
+        <w:t xml:space="preserve"> 5 rows from 8p4.pkl in 44.87s</w:t>
       </w:r>
       <w:r>
         <w:rPr>
@@ -3961,7 +3778,6 @@
           <w:lang w:eastAsia="en-US"/>
         </w:rPr>
         <w:br/>
-        <w:t>Which was for:</w:t>
       </w:r>
       <w:r>
         <w:rPr>
@@ -3972,8 +3788,8 @@
           <w:lang w:eastAsia="en-US"/>
         </w:rPr>
         <w:br/>
-      </w:r>
-      <w:proofErr w:type="spellStart"/>
+        <w:t>Going to try "more rows" LOL first though...</w:t>
+      </w:r>
       <w:r>
         <w:rPr>
           <w:rFonts w:ascii="Courier New" w:eastAsia="Times New Roman" w:hAnsi="Courier New" w:cs="Courier New"/>
@@ -3982,9 +3798,8 @@
           <w:szCs w:val="20"/>
           <w:lang w:eastAsia="en-US"/>
         </w:rPr>
-        <w:t>INFO:__main__:Processed</w:t>
-      </w:r>
-      <w:proofErr w:type="spellEnd"/>
+        <w:br/>
+      </w:r>
       <w:r>
         <w:rPr>
           <w:rFonts w:ascii="Courier New" w:eastAsia="Times New Roman" w:hAnsi="Courier New" w:cs="Courier New"/>
@@ -3993,7 +3808,8 @@
           <w:szCs w:val="20"/>
           <w:lang w:eastAsia="en-US"/>
         </w:rPr>
-        <w:t xml:space="preserve"> 5 rows from 8p4.pkl in 44.87s</w:t>
+        <w:br/>
+        <w:t>Or this nonsense:</w:t>
       </w:r>
       <w:r>
         <w:rPr>
@@ -4004,6 +3820,7 @@
           <w:lang w:eastAsia="en-US"/>
         </w:rPr>
         <w:br/>
+        <w:t>2025-04-20 23:30:45,102 - __main__ - INFO - Processing row 1/5000 in 7p2.pkl</w:t>
       </w:r>
       <w:r>
         <w:rPr>
@@ -4014,7 +3831,7 @@
           <w:lang w:eastAsia="en-US"/>
         </w:rPr>
         <w:br/>
-        <w:t>Going to try "more rows" LOL first though...</w:t>
+        <w:t>2025-04-20 23:30:45,129 - __main__ - WARNING - Found 0 matches for coordinate (-125, 87, -33) at time 561</w:t>
       </w:r>
       <w:r>
         <w:rPr>
@@ -4025,6 +3842,7 @@
           <w:lang w:eastAsia="en-US"/>
         </w:rPr>
         <w:br/>
+        <w:t>2025-04-20 23:30:45,134 - __main__ - WARNING - Found 0 matches for coordinate (-121, 87, -33) at time 561</w:t>
       </w:r>
       <w:r>
         <w:rPr>
@@ -4035,7 +3853,7 @@
           <w:lang w:eastAsia="en-US"/>
         </w:rPr>
         <w:br/>
-        <w:t>Or this nonsense:</w:t>
+        <w:t>2025-04-20 23:30:45,168 - __main__ - WARNING - Found 0 matches for coordinate (-121, 87, -33) at time 561</w:t>
       </w:r>
       <w:r>
         <w:rPr>
@@ -4046,7 +3864,6 @@
           <w:lang w:eastAsia="en-US"/>
         </w:rPr>
         <w:br/>
-        <w:t>2025-04-20 23:30:45,102 - __main__ - INFO - Processing row 1/5000 in 7p2.pkl</w:t>
       </w:r>
       <w:r>
         <w:rPr>
@@ -4057,7 +3874,6 @@
           <w:lang w:eastAsia="en-US"/>
         </w:rPr>
         <w:br/>
-        <w:t>2025-04-20 23:30:45,129 - __main__ - WARNING - Found 0 matches for coordinate (-125, 87, -33) at time 561</w:t>
       </w:r>
       <w:r>
         <w:rPr>
@@ -4068,7 +3884,7 @@
           <w:lang w:eastAsia="en-US"/>
         </w:rPr>
         <w:br/>
-        <w:t>2025-04-20 23:30:45,134 - __main__ - WARNING - Found 0 matches for coordinate (-121, 87, -33) at time 561</w:t>
+        <w:t>or this one:</w:t>
       </w:r>
       <w:r>
         <w:rPr>
@@ -4079,7 +3895,6 @@
           <w:lang w:eastAsia="en-US"/>
         </w:rPr>
         <w:br/>
-        <w:t>2025-04-20 23:30:45,168 - __main__ - WARNING - Found 0 matches for coordinate (-121, 87, -33) at time 561</w:t>
       </w:r>
       <w:r>
         <w:rPr>
@@ -4090,6 +3905,7 @@
           <w:lang w:eastAsia="en-US"/>
         </w:rPr>
         <w:br/>
+        <w:t>2025-04-20 22:53:31,340 - __main__ - INFO - Processing row 1/5000 in 7p8.pkl</w:t>
       </w:r>
       <w:r>
         <w:rPr>
@@ -4100,6 +3916,7 @@
           <w:lang w:eastAsia="en-US"/>
         </w:rPr>
         <w:br/>
+        <w:t>2025-04-20 22:53:31,369 - __main__ - WARNING - Found 0 matches for coordinate (-125, 87, -33) at time 397</w:t>
       </w:r>
       <w:r>
         <w:rPr>
@@ -4110,7 +3927,7 @@
           <w:lang w:eastAsia="en-US"/>
         </w:rPr>
         <w:br/>
-        <w:t>or this one:</w:t>
+        <w:t>2025-04-20 22:53:31,374 - __main__ - WARNING - Found 0 matches for coordinate (-121, 87, -33) at time 397</w:t>
       </w:r>
       <w:r>
         <w:rPr>
@@ -4121,6 +3938,7 @@
           <w:lang w:eastAsia="en-US"/>
         </w:rPr>
         <w:br/>
+        <w:t>2025-04-20 22:53:31,407 - __main__ - WARNING - Found 0 matches for coordinate (-121, 87, -33) at time 397</w:t>
       </w:r>
       <w:r>
         <w:rPr>
@@ -4131,7 +3949,6 @@
           <w:lang w:eastAsia="en-US"/>
         </w:rPr>
         <w:br/>
-        <w:t>2025-04-20 22:53:31,340 - __main__ - INFO - Processing row 1/5000 in 7p8.pkl</w:t>
       </w:r>
       <w:r>
         <w:rPr>
@@ -4142,8 +3959,9 @@
           <w:lang w:eastAsia="en-US"/>
         </w:rPr>
         <w:br/>
-        <w:t>2025-04-20 22:53:31,369 - __main__ - WARNING - Found 0 matches for coordinate (-125, 87, -33) at time 397</w:t>
-      </w:r>
+        <w:t xml:space="preserve">Seems like this particular location has "random" missing coordinates, but even more oddly only three at some random time and given the same </w:t>
+      </w:r>
+      <w:proofErr w:type="spellStart"/>
       <w:r>
         <w:rPr>
           <w:rFonts w:ascii="Courier New" w:eastAsia="Times New Roman" w:hAnsi="Courier New" w:cs="Courier New"/>
@@ -4152,9 +3970,9 @@
           <w:szCs w:val="20"/>
           <w:lang w:eastAsia="en-US"/>
         </w:rPr>
-        <w:br/>
-        <w:t>2025-04-20 22:53:31,374 - __main__ - WARNING - Found 0 matches for coordinate (-121, 87, -33) at time 397</w:t>
-      </w:r>
+        <w:t>x,y,z</w:t>
+      </w:r>
+      <w:proofErr w:type="spellEnd"/>
       <w:r>
         <w:rPr>
           <w:rFonts w:ascii="Courier New" w:eastAsia="Times New Roman" w:hAnsi="Courier New" w:cs="Courier New"/>
@@ -4163,51 +3981,55 @@
           <w:szCs w:val="20"/>
           <w:lang w:eastAsia="en-US"/>
         </w:rPr>
-        <w:br/>
-        <w:t>2025-04-20 22:53:31,407 - __main__ - WARNING - Found 0 matches for coordinate (-121, 87, -33) at time 397</w:t>
-      </w:r>
-      <w:r>
-        <w:rPr>
-          <w:rFonts w:ascii="Courier New" w:eastAsia="Times New Roman" w:hAnsi="Courier New" w:cs="Courier New"/>
-          <w:color w:val="FFFFFF"/>
-          <w:sz w:val="20"/>
-          <w:szCs w:val="20"/>
-          <w:lang w:eastAsia="en-US"/>
-        </w:rPr>
-        <w:br/>
-      </w:r>
-      <w:r>
-        <w:rPr>
-          <w:rFonts w:ascii="Courier New" w:eastAsia="Times New Roman" w:hAnsi="Courier New" w:cs="Courier New"/>
-          <w:color w:val="FFFFFF"/>
-          <w:sz w:val="20"/>
-          <w:szCs w:val="20"/>
-          <w:lang w:eastAsia="en-US"/>
-        </w:rPr>
-        <w:br/>
-        <w:t xml:space="preserve">Seems like this particular location has "random" missing coordinates, but even more oddly only three at some random time and given the same </w:t>
+        <w:t>.</w:t>
+      </w:r>
+    </w:p>
+    <w:p>
+      <w:pPr>
+        <w:pStyle w:val="ListParagraph"/>
+      </w:pPr>
+    </w:p>
+    <w:p>
+      <w:pPr>
+        <w:pStyle w:val="ListParagraph"/>
+      </w:pPr>
+      <w:r>
+        <w:lastRenderedPageBreak/>
+        <w:t>I’m not 100% sure on how to handle this… First things first, I’m going to run something to interrogate the initial input files, to ensure that this problem was actually in that data. I’ll write a class:</w:t>
+      </w:r>
+    </w:p>
+    <w:p>
+      <w:pPr>
+        <w:pStyle w:val="ListParagraph"/>
+      </w:pPr>
+    </w:p>
+    <w:p>
+      <w:pPr>
+        <w:pStyle w:val="ListParagraph"/>
+      </w:pPr>
+      <w:r>
+        <w:t>PreProcessingValidate.py</w:t>
+      </w:r>
+    </w:p>
+    <w:p>
+      <w:pPr>
+        <w:pStyle w:val="ListParagraph"/>
+      </w:pPr>
+    </w:p>
+    <w:p>
+      <w:pPr>
+        <w:pStyle w:val="ListParagraph"/>
+      </w:pPr>
+      <w:r>
+        <w:t xml:space="preserve">That will look at the number of combinations of </w:t>
       </w:r>
       <w:proofErr w:type="spellStart"/>
       <w:r>
-        <w:rPr>
-          <w:rFonts w:ascii="Courier New" w:eastAsia="Times New Roman" w:hAnsi="Courier New" w:cs="Courier New"/>
-          <w:color w:val="FFFFFF"/>
-          <w:sz w:val="20"/>
-          <w:szCs w:val="20"/>
-          <w:lang w:eastAsia="en-US"/>
-        </w:rPr>
         <w:t>x,y,z</w:t>
       </w:r>
       <w:proofErr w:type="spellEnd"/>
       <w:r>
-        <w:rPr>
-          <w:rFonts w:ascii="Courier New" w:eastAsia="Times New Roman" w:hAnsi="Courier New" w:cs="Courier New"/>
-          <w:color w:val="FFFFFF"/>
-          <w:sz w:val="20"/>
-          <w:szCs w:val="20"/>
-          <w:lang w:eastAsia="en-US"/>
-        </w:rPr>
-        <w:t>.</w:t>
+        <w:t xml:space="preserve"> per time slice and see if they are consistent.</w:t>
       </w:r>
     </w:p>
     <w:p>
@@ -4219,31 +4041,28 @@
       <w:pPr>
         <w:pStyle w:val="ListParagraph"/>
       </w:pPr>
-      <w:r>
-        <w:lastRenderedPageBreak/>
-        <w:t xml:space="preserve">I’m not 100% sure on how to handle this… First things first, I’m going to run something to interrogate the initial input files, to ensure that this problem was </w:t>
-      </w:r>
-      <w:proofErr w:type="gramStart"/>
-      <w:r>
-        <w:t>actually in</w:t>
-      </w:r>
-      <w:proofErr w:type="gramEnd"/>
-      <w:r>
-        <w:t xml:space="preserve"> that data. I’ll write a class:</w:t>
-      </w:r>
     </w:p>
     <w:p>
       <w:pPr>
         <w:pStyle w:val="ListParagraph"/>
       </w:pPr>
+      <w:r>
+        <w:t xml:space="preserve">Seems that even in the “source” data </w:t>
+      </w:r>
+      <w:r>
+        <w:t>which in my computer is:</w:t>
+      </w:r>
+      <w:r>
+        <w:br/>
+      </w:r>
+      <w:r>
+        <w:t>/Users/kkreth/PycharmProjects/data/all_data_cleaned_dtype_correct</w:t>
+      </w:r>
     </w:p>
     <w:p>
       <w:pPr>
         <w:pStyle w:val="ListParagraph"/>
       </w:pPr>
-      <w:r>
-        <w:t>PreProcessingValidate.py</w:t>
-      </w:r>
     </w:p>
     <w:p>
       <w:pPr>
@@ -4255,64 +4074,9 @@
         <w:pStyle w:val="ListParagraph"/>
       </w:pPr>
       <w:r>
-        <w:t xml:space="preserve">That will look at the number of combinations of </w:t>
-      </w:r>
-      <w:proofErr w:type="spellStart"/>
-      <w:proofErr w:type="gramStart"/>
-      <w:r>
-        <w:t>x,y</w:t>
-      </w:r>
-      <w:proofErr w:type="gramEnd"/>
-      <w:r>
-        <w:t>,z</w:t>
-      </w:r>
-      <w:proofErr w:type="spellEnd"/>
-      <w:r>
-        <w:t xml:space="preserve"> per time slice and see if they are consistent.</w:t>
-      </w:r>
-    </w:p>
-    <w:p>
-      <w:pPr>
-        <w:pStyle w:val="ListParagraph"/>
-      </w:pPr>
-    </w:p>
-    <w:p>
-      <w:pPr>
-        <w:pStyle w:val="ListParagraph"/>
-      </w:pPr>
-    </w:p>
-    <w:p>
-      <w:pPr>
-        <w:pStyle w:val="ListParagraph"/>
-      </w:pPr>
-      <w:r>
-        <w:t xml:space="preserve">Seems that even in the “source” data </w:t>
-      </w:r>
-      <w:r>
-        <w:t>which in my computer is:</w:t>
-      </w:r>
-      <w:r>
-        <w:br/>
-      </w:r>
-      <w:r>
-        <w:t>/Users/kkreth/PycharmProjects/data/all_data_cleaned_dtype_correct</w:t>
-      </w:r>
-    </w:p>
-    <w:p>
-      <w:pPr>
-        <w:pStyle w:val="ListParagraph"/>
-      </w:pPr>
-    </w:p>
-    <w:p>
-      <w:pPr>
-        <w:pStyle w:val="ListParagraph"/>
-      </w:pPr>
-    </w:p>
-    <w:p>
-      <w:pPr>
-        <w:pStyle w:val="ListParagraph"/>
-      </w:pPr>
-      <w:r>
+        <w:rPr>
+          <w:noProof/>
+        </w:rPr>
         <w:drawing>
           <wp:inline distT="0" distB="0" distL="0" distR="0" wp14:anchorId="37F74C3E" wp14:editId="04728FCC">
             <wp:extent cx="5943600" cy="3567430"/>
@@ -4361,8 +4125,6 @@
       <w:r>
         <w:lastRenderedPageBreak/>
         <w:br/>
-      </w:r>
-      <w:r>
         <w:t>Or this nonsense:</w:t>
       </w:r>
     </w:p>
@@ -4391,15 +4153,7 @@
     </w:p>
     <w:p>
       <w:r>
-        <w:t xml:space="preserve">OK, so we need to perform a “unit </w:t>
-      </w:r>
-      <w:proofErr w:type="gramStart"/>
-      <w:r>
-        <w:t>test”…</w:t>
-      </w:r>
-      <w:proofErr w:type="gramEnd"/>
-      <w:r>
-        <w:t>we have one that will be formal, once we have generated all data</w:t>
+        <w:t>OK, so we need to perform a “unit test”…we have one that will be formal, once we have generated all data</w:t>
       </w:r>
       <w:r>
         <w:t>, but we need a manual one for now.</w:t>
@@ -4413,25 +4167,12 @@
     </w:p>
     <w:p>
       <w:proofErr w:type="spellStart"/>
-      <w:proofErr w:type="gramStart"/>
-      <w:r>
-        <w:t>X,y</w:t>
-      </w:r>
-      <w:proofErr w:type="gramEnd"/>
-      <w:r>
-        <w:t>,z</w:t>
+      <w:r>
+        <w:t>X,y,z</w:t>
       </w:r>
       <w:proofErr w:type="spellEnd"/>
       <w:r>
-        <w:t xml:space="preserve"> coordinates of -42,</w:t>
-      </w:r>
-      <w:proofErr w:type="gramStart"/>
-      <w:r>
-        <w:t>75,-</w:t>
-      </w:r>
-      <w:proofErr w:type="gramEnd"/>
-      <w:r>
-        <w:t>21</w:t>
+        <w:t xml:space="preserve"> coordinates of -42,75,-21</w:t>
       </w:r>
     </w:p>
     <w:p/>
@@ -4984,19 +4725,14 @@
       </w:r>
       <w:r>
         <w:br/>
-        <w:t>(-50,</w:t>
-      </w:r>
-      <w:proofErr w:type="gramStart"/>
-      <w:r>
-        <w:t>67,-</w:t>
-      </w:r>
-      <w:proofErr w:type="gramEnd"/>
-      <w:r>
-        <w:t>29)</w:t>
-      </w:r>
-    </w:p>
-    <w:p>
-      <w:r>
+        <w:t>(-50,67,-29)</w:t>
+      </w:r>
+    </w:p>
+    <w:p>
+      <w:r>
+        <w:rPr>
+          <w:noProof/>
+        </w:rPr>
         <w:drawing>
           <wp:inline distT="0" distB="0" distL="0" distR="0" wp14:anchorId="46002377" wp14:editId="7C99FA50">
             <wp:extent cx="5943600" cy="259080"/>
@@ -5036,19 +4772,14 @@
     </w:p>
     <w:p>
       <w:r>
-        <w:t>(-50,</w:t>
-      </w:r>
-      <w:proofErr w:type="gramStart"/>
-      <w:r>
-        <w:t>67,-</w:t>
-      </w:r>
-      <w:proofErr w:type="gramEnd"/>
-      <w:r>
-        <w:t>25)</w:t>
-      </w:r>
-    </w:p>
-    <w:p>
-      <w:r>
+        <w:t>(-50,67,-25)</w:t>
+      </w:r>
+    </w:p>
+    <w:p>
+      <w:r>
+        <w:rPr>
+          <w:noProof/>
+        </w:rPr>
         <w:drawing>
           <wp:inline distT="0" distB="0" distL="0" distR="0" wp14:anchorId="4560CD03" wp14:editId="143E6373">
             <wp:extent cx="5943600" cy="271780"/>
@@ -5125,13 +4856,8 @@
         <w:t xml:space="preserve"> for the “</w:t>
       </w:r>
       <w:proofErr w:type="spellStart"/>
-      <w:proofErr w:type="gramStart"/>
-      <w:r>
-        <w:t>x,y</w:t>
-      </w:r>
-      <w:proofErr w:type="gramEnd"/>
-      <w:r>
-        <w:t>,z</w:t>
+      <w:r>
+        <w:t>x,y,z</w:t>
       </w:r>
       <w:proofErr w:type="spellEnd"/>
       <w:r>
@@ -5140,6 +4866,9 @@
     </w:p>
     <w:p>
       <w:r>
+        <w:rPr>
+          <w:noProof/>
+        </w:rPr>
         <w:drawing>
           <wp:inline distT="0" distB="0" distL="0" distR="0" wp14:anchorId="4799D669" wp14:editId="2A30F69A">
             <wp:extent cx="1473200" cy="698500"/>
@@ -5180,6 +4909,9 @@
     <w:p/>
     <w:p>
       <w:r>
+        <w:rPr>
+          <w:noProof/>
+        </w:rPr>
         <w:drawing>
           <wp:inline distT="0" distB="0" distL="0" distR="0" wp14:anchorId="62947DF3" wp14:editId="1918C51A">
             <wp:extent cx="1905000" cy="2578100"/>
@@ -5223,14 +4955,9 @@
     <w:p/>
     <w:p>
       <w:proofErr w:type="spellStart"/>
-      <w:proofErr w:type="gramStart"/>
       <w:r>
         <w:lastRenderedPageBreak/>
-        <w:t>Vx,vy</w:t>
-      </w:r>
-      <w:proofErr w:type="gramEnd"/>
-      <w:r>
-        <w:t>,vz</w:t>
+        <w:t>Vx,vy,vz</w:t>
       </w:r>
       <w:proofErr w:type="spellEnd"/>
       <w:r>
@@ -5243,6 +4970,9 @@
         <w:br/>
       </w:r>
       <w:r>
+        <w:rPr>
+          <w:noProof/>
+        </w:rPr>
         <w:drawing>
           <wp:inline distT="0" distB="0" distL="0" distR="0" wp14:anchorId="70220117" wp14:editId="07BDFDED">
             <wp:extent cx="5943600" cy="4756150"/>
@@ -5292,13 +5022,8 @@
         <w:t xml:space="preserve">If these are the </w:t>
       </w:r>
       <w:proofErr w:type="spellStart"/>
-      <w:proofErr w:type="gramStart"/>
-      <w:r>
-        <w:t>x,y</w:t>
-      </w:r>
-      <w:proofErr w:type="gramEnd"/>
-      <w:r>
-        <w:t>,z</w:t>
+      <w:r>
+        <w:t>x,y,z</w:t>
       </w:r>
       <w:proofErr w:type="spellEnd"/>
       <w:r>
@@ -5312,6 +5037,1325 @@
       </w:r>
     </w:p>
     <w:p/>
+    <w:p/>
+    <w:p/>
+    <w:p/>
+    <w:p>
+      <w:pPr>
+        <w:spacing w:before="100" w:beforeAutospacing="1" w:after="100" w:afterAutospacing="1"/>
+        <w:rPr>
+          <w:color w:val="000000"/>
+        </w:rPr>
+      </w:pPr>
+      <w:r>
+        <w:rPr>
+          <w:color w:val="000000"/>
+        </w:rPr>
+        <w:t>The</w:t>
+      </w:r>
+      <w:r>
+        <w:rPr>
+          <w:rStyle w:val="apple-converted-space"/>
+          <w:color w:val="000000"/>
+        </w:rPr>
+        <w:t> </w:t>
+      </w:r>
+      <w:r>
+        <w:rPr>
+          <w:rStyle w:val="Strong"/>
+          <w:color w:val="000000"/>
+        </w:rPr>
+        <w:t>Kolmogorov barrier</w:t>
+      </w:r>
+      <w:r>
+        <w:rPr>
+          <w:rStyle w:val="apple-converted-space"/>
+          <w:color w:val="000000"/>
+        </w:rPr>
+        <w:t> </w:t>
+      </w:r>
+      <w:r>
+        <w:rPr>
+          <w:color w:val="000000"/>
+        </w:rPr>
+        <w:t>refers to a fundamental</w:t>
+      </w:r>
+      <w:r>
+        <w:rPr>
+          <w:rStyle w:val="apple-converted-space"/>
+          <w:color w:val="000000"/>
+        </w:rPr>
+        <w:t> </w:t>
+      </w:r>
+      <w:r>
+        <w:rPr>
+          <w:rStyle w:val="Emphasis"/>
+          <w:color w:val="000000"/>
+        </w:rPr>
+        <w:t>theoretical limit</w:t>
+      </w:r>
+      <w:r>
+        <w:rPr>
+          <w:rStyle w:val="apple-converted-space"/>
+          <w:color w:val="000000"/>
+        </w:rPr>
+        <w:t> </w:t>
+      </w:r>
+      <w:r>
+        <w:rPr>
+          <w:color w:val="000000"/>
+        </w:rPr>
+        <w:t>on how much a smooth signal (such as a physical system's state or a fluid's velocity field) can be compressed without unacceptable loss of accuracy.</w:t>
+      </w:r>
+    </w:p>
+    <w:p>
+      <w:pPr>
+        <w:spacing w:before="100" w:beforeAutospacing="1" w:after="100" w:afterAutospacing="1"/>
+        <w:rPr>
+          <w:color w:val="000000"/>
+        </w:rPr>
+      </w:pPr>
+      <w:r>
+        <w:rPr>
+          <w:color w:val="000000"/>
+        </w:rPr>
+        <w:t>At its core, the idea is:</w:t>
+      </w:r>
+    </w:p>
+    <w:p>
+      <w:pPr>
+        <w:numPr>
+          <w:ilvl w:val="0"/>
+          <w:numId w:val="14"/>
+        </w:numPr>
+        <w:spacing w:before="100" w:beforeAutospacing="1" w:after="100" w:afterAutospacing="1" w:line="240" w:lineRule="auto"/>
+        <w:rPr>
+          <w:color w:val="000000"/>
+        </w:rPr>
+      </w:pPr>
+      <w:r>
+        <w:rPr>
+          <w:color w:val="000000"/>
+        </w:rPr>
+        <w:t>In many real-world systems (like turbulence, fluid flow, weather, etc.), the amount of</w:t>
+      </w:r>
+      <w:r>
+        <w:rPr>
+          <w:rStyle w:val="apple-converted-space"/>
+          <w:color w:val="000000"/>
+        </w:rPr>
+        <w:t> </w:t>
+      </w:r>
+      <w:r>
+        <w:rPr>
+          <w:rStyle w:val="Emphasis"/>
+          <w:color w:val="000000"/>
+        </w:rPr>
+        <w:t>truly compressible information</w:t>
+      </w:r>
+      <w:r>
+        <w:rPr>
+          <w:rStyle w:val="apple-converted-space"/>
+          <w:color w:val="000000"/>
+        </w:rPr>
+        <w:t> </w:t>
+      </w:r>
+      <w:r>
+        <w:rPr>
+          <w:color w:val="000000"/>
+        </w:rPr>
+        <w:t>is fundamentally limited by the</w:t>
+      </w:r>
+      <w:r>
+        <w:rPr>
+          <w:rStyle w:val="apple-converted-space"/>
+          <w:color w:val="000000"/>
+        </w:rPr>
+        <w:t> </w:t>
+      </w:r>
+      <w:r>
+        <w:rPr>
+          <w:rStyle w:val="Emphasis"/>
+          <w:color w:val="000000"/>
+        </w:rPr>
+        <w:t>inherent complexity</w:t>
+      </w:r>
+      <w:r>
+        <w:rPr>
+          <w:rStyle w:val="apple-converted-space"/>
+          <w:color w:val="000000"/>
+        </w:rPr>
+        <w:t> </w:t>
+      </w:r>
+      <w:r>
+        <w:rPr>
+          <w:color w:val="000000"/>
+        </w:rPr>
+        <w:t>and</w:t>
+      </w:r>
+      <w:r>
+        <w:rPr>
+          <w:rStyle w:val="apple-converted-space"/>
+          <w:color w:val="000000"/>
+        </w:rPr>
+        <w:t> </w:t>
+      </w:r>
+      <w:r>
+        <w:rPr>
+          <w:rStyle w:val="Emphasis"/>
+          <w:color w:val="000000"/>
+        </w:rPr>
+        <w:t>unpredictability</w:t>
+      </w:r>
+      <w:r>
+        <w:rPr>
+          <w:rStyle w:val="apple-converted-space"/>
+          <w:color w:val="000000"/>
+        </w:rPr>
+        <w:t> </w:t>
+      </w:r>
+      <w:r>
+        <w:rPr>
+          <w:color w:val="000000"/>
+        </w:rPr>
+        <w:t>(entropy) of the system.</w:t>
+      </w:r>
+    </w:p>
+    <w:p>
+      <w:pPr>
+        <w:numPr>
+          <w:ilvl w:val="0"/>
+          <w:numId w:val="14"/>
+        </w:numPr>
+        <w:spacing w:before="100" w:beforeAutospacing="1" w:after="100" w:afterAutospacing="1" w:line="240" w:lineRule="auto"/>
+        <w:rPr>
+          <w:color w:val="000000"/>
+        </w:rPr>
+      </w:pPr>
+      <w:r>
+        <w:rPr>
+          <w:rStyle w:val="Strong"/>
+          <w:color w:val="000000"/>
+        </w:rPr>
+        <w:t>Andrey Kolmogorov</w:t>
+      </w:r>
+      <w:r>
+        <w:rPr>
+          <w:color w:val="000000"/>
+        </w:rPr>
+        <w:t>, in the mid-20th century, helped formalize these ideas with concepts like</w:t>
+      </w:r>
+      <w:r>
+        <w:rPr>
+          <w:rStyle w:val="apple-converted-space"/>
+          <w:color w:val="000000"/>
+        </w:rPr>
+        <w:t> </w:t>
+      </w:r>
+      <w:r>
+        <w:rPr>
+          <w:rStyle w:val="Emphasis"/>
+          <w:color w:val="000000"/>
+        </w:rPr>
+        <w:t>Kolmogorov complexity</w:t>
+      </w:r>
+      <w:r>
+        <w:rPr>
+          <w:rStyle w:val="apple-converted-space"/>
+          <w:color w:val="000000"/>
+        </w:rPr>
+        <w:t> </w:t>
+      </w:r>
+      <w:r>
+        <w:rPr>
+          <w:color w:val="000000"/>
+        </w:rPr>
+        <w:t>(how short a program can be that generates a given object) and</w:t>
+      </w:r>
+      <w:r>
+        <w:rPr>
+          <w:rStyle w:val="apple-converted-space"/>
+          <w:color w:val="000000"/>
+        </w:rPr>
+        <w:t> </w:t>
+      </w:r>
+      <w:r>
+        <w:rPr>
+          <w:rStyle w:val="Emphasis"/>
+          <w:color w:val="000000"/>
+        </w:rPr>
+        <w:t>Kolmogorov entropy</w:t>
+      </w:r>
+      <w:r>
+        <w:rPr>
+          <w:rStyle w:val="apple-converted-space"/>
+          <w:color w:val="000000"/>
+        </w:rPr>
+        <w:t> </w:t>
+      </w:r>
+      <w:r>
+        <w:rPr>
+          <w:color w:val="000000"/>
+        </w:rPr>
+        <w:t>(how quickly a system's information becomes unpredictable over time).</w:t>
+      </w:r>
+    </w:p>
+    <w:p>
+      <w:pPr>
+        <w:numPr>
+          <w:ilvl w:val="0"/>
+          <w:numId w:val="14"/>
+        </w:numPr>
+        <w:spacing w:before="100" w:beforeAutospacing="1" w:after="100" w:afterAutospacing="1" w:line="240" w:lineRule="auto"/>
+        <w:rPr>
+          <w:color w:val="000000"/>
+        </w:rPr>
+      </w:pPr>
+      <w:r>
+        <w:rPr>
+          <w:rStyle w:val="Strong"/>
+          <w:color w:val="000000"/>
+        </w:rPr>
+        <w:t>The Kolmogorov barrier</w:t>
+      </w:r>
+      <w:r>
+        <w:rPr>
+          <w:rStyle w:val="apple-converted-space"/>
+          <w:color w:val="000000"/>
+        </w:rPr>
+        <w:t> </w:t>
+      </w:r>
+      <w:r>
+        <w:rPr>
+          <w:color w:val="000000"/>
+        </w:rPr>
+        <w:t>arises when you try to encode or compress signals that are governed by chaotic or highly entropic dynamics:</w:t>
+      </w:r>
+      <w:r>
+        <w:rPr>
+          <w:rStyle w:val="apple-converted-space"/>
+          <w:color w:val="000000"/>
+        </w:rPr>
+        <w:t> </w:t>
+      </w:r>
+      <w:r>
+        <w:rPr>
+          <w:rStyle w:val="Strong"/>
+          <w:color w:val="000000"/>
+        </w:rPr>
+        <w:t>you can't compress beyond a certain point without losing critical details</w:t>
+      </w:r>
+      <w:r>
+        <w:rPr>
+          <w:color w:val="000000"/>
+        </w:rPr>
+        <w:t>.</w:t>
+      </w:r>
+    </w:p>
+    <w:p>
+      <w:pPr>
+        <w:spacing w:before="100" w:beforeAutospacing="1" w:after="100" w:afterAutospacing="1"/>
+        <w:rPr>
+          <w:color w:val="000000"/>
+        </w:rPr>
+      </w:pPr>
+      <w:r>
+        <w:rPr>
+          <w:color w:val="000000"/>
+        </w:rPr>
+        <w:t>In other words:</w:t>
+      </w:r>
+    </w:p>
+    <w:p>
+      <w:pPr>
+        <w:spacing w:before="100" w:beforeAutospacing="1" w:after="100" w:afterAutospacing="1"/>
+        <w:rPr>
+          <w:color w:val="000000"/>
+        </w:rPr>
+      </w:pPr>
+      <w:r>
+        <w:rPr>
+          <w:rStyle w:val="Strong"/>
+          <w:color w:val="000000"/>
+        </w:rPr>
+        <w:t>If a system has high intrinsic entropy or complexity, no amount of clever compression can reduce its information content below a certain threshold without fundamentally misrepresenting it.</w:t>
+      </w:r>
+    </w:p>
+    <w:p>
+      <w:pPr>
+        <w:spacing w:after="0"/>
+        <w:rPr>
+          <w:color w:val="auto"/>
+        </w:rPr>
+      </w:pPr>
+      <w:r>
+        <w:rPr>
+          <w:noProof/>
+        </w:rPr>
+        <w:pict w14:anchorId="711F34E0">
+          <v:rect id="_x0000_i1029" alt="" style="width:468pt;height:.05pt;mso-width-percent:0;mso-height-percent:0;mso-width-percent:0;mso-height-percent:0" o:hralign="center" o:hrstd="t" o:hr="t" fillcolor="#a0a0a0" stroked="f"/>
+        </w:pict>
+      </w:r>
+    </w:p>
+    <w:p>
+      <w:pPr>
+        <w:spacing w:before="100" w:beforeAutospacing="1" w:after="100" w:afterAutospacing="1"/>
+        <w:rPr>
+          <w:color w:val="000000"/>
+        </w:rPr>
+      </w:pPr>
+      <w:r>
+        <w:rPr>
+          <w:rStyle w:val="Strong"/>
+          <w:color w:val="000000"/>
+        </w:rPr>
+        <w:t>In practical terms</w:t>
+      </w:r>
+      <w:r>
+        <w:rPr>
+          <w:color w:val="000000"/>
+        </w:rPr>
+        <w:t>, the Kolmogorov barrier shows up in areas like:</w:t>
+      </w:r>
+    </w:p>
+    <w:p>
+      <w:pPr>
+        <w:numPr>
+          <w:ilvl w:val="0"/>
+          <w:numId w:val="15"/>
+        </w:numPr>
+        <w:spacing w:before="100" w:beforeAutospacing="1" w:after="100" w:afterAutospacing="1" w:line="240" w:lineRule="auto"/>
+        <w:rPr>
+          <w:color w:val="000000"/>
+        </w:rPr>
+      </w:pPr>
+      <w:r>
+        <w:rPr>
+          <w:rStyle w:val="Strong"/>
+          <w:color w:val="000000"/>
+        </w:rPr>
+        <w:t>Data compression</w:t>
+      </w:r>
+      <w:r>
+        <w:rPr>
+          <w:rStyle w:val="apple-converted-space"/>
+          <w:color w:val="000000"/>
+        </w:rPr>
+        <w:t> </w:t>
+      </w:r>
+      <w:r>
+        <w:rPr>
+          <w:color w:val="000000"/>
+        </w:rPr>
+        <w:t>(limits how well you can compress chaotic signals like weather or turbulence).</w:t>
+      </w:r>
+    </w:p>
+    <w:p>
+      <w:pPr>
+        <w:numPr>
+          <w:ilvl w:val="0"/>
+          <w:numId w:val="15"/>
+        </w:numPr>
+        <w:spacing w:before="100" w:beforeAutospacing="1" w:after="100" w:afterAutospacing="1" w:line="240" w:lineRule="auto"/>
+        <w:rPr>
+          <w:color w:val="000000"/>
+        </w:rPr>
+      </w:pPr>
+      <w:r>
+        <w:rPr>
+          <w:rStyle w:val="Strong"/>
+          <w:color w:val="000000"/>
+        </w:rPr>
+        <w:lastRenderedPageBreak/>
+        <w:t>Reduced-order modeling</w:t>
+      </w:r>
+      <w:r>
+        <w:rPr>
+          <w:rStyle w:val="apple-converted-space"/>
+          <w:color w:val="000000"/>
+        </w:rPr>
+        <w:t> </w:t>
+      </w:r>
+      <w:r>
+        <w:rPr>
+          <w:color w:val="000000"/>
+        </w:rPr>
+        <w:t>(limits how low you can go in dimension reduction for complex physical systems without unacceptable loss).</w:t>
+      </w:r>
+    </w:p>
+    <w:p>
+      <w:pPr>
+        <w:numPr>
+          <w:ilvl w:val="0"/>
+          <w:numId w:val="15"/>
+        </w:numPr>
+        <w:spacing w:before="100" w:beforeAutospacing="1" w:after="100" w:afterAutospacing="1" w:line="240" w:lineRule="auto"/>
+        <w:rPr>
+          <w:color w:val="000000"/>
+        </w:rPr>
+      </w:pPr>
+      <w:r>
+        <w:rPr>
+          <w:rStyle w:val="Strong"/>
+          <w:color w:val="000000"/>
+        </w:rPr>
+        <w:t>Autoencoders</w:t>
+      </w:r>
+      <w:r>
+        <w:rPr>
+          <w:rStyle w:val="apple-converted-space"/>
+          <w:color w:val="000000"/>
+        </w:rPr>
+        <w:t> </w:t>
+      </w:r>
+      <w:r>
+        <w:rPr>
+          <w:color w:val="000000"/>
+        </w:rPr>
+        <w:t>(especially for chaotic or highly dynamic data — you eventually can't make the latent space smaller without catastrophic reconstruction errors).</w:t>
+      </w:r>
+    </w:p>
+    <w:p>
+      <w:pPr>
+        <w:spacing w:after="0"/>
+        <w:rPr>
+          <w:color w:val="auto"/>
+        </w:rPr>
+      </w:pPr>
+      <w:r>
+        <w:rPr>
+          <w:noProof/>
+        </w:rPr>
+        <w:pict w14:anchorId="553C66D1">
+          <v:rect id="_x0000_i1028" alt="" style="width:468pt;height:.05pt;mso-width-percent:0;mso-height-percent:0;mso-width-percent:0;mso-height-percent:0" o:hralign="center" o:hrstd="t" o:hr="t" fillcolor="#a0a0a0" stroked="f"/>
+        </w:pict>
+      </w:r>
+    </w:p>
+    <w:p>
+      <w:pPr>
+        <w:pStyle w:val="Heading3"/>
+        <w:rPr>
+          <w:color w:val="000000"/>
+        </w:rPr>
+      </w:pPr>
+      <w:r>
+        <w:rPr>
+          <w:color w:val="000000"/>
+        </w:rPr>
+        <w:t>A more mathematical flavor:</w:t>
+      </w:r>
+    </w:p>
+    <w:p>
+      <w:pPr>
+        <w:numPr>
+          <w:ilvl w:val="0"/>
+          <w:numId w:val="16"/>
+        </w:numPr>
+        <w:spacing w:before="100" w:beforeAutospacing="1" w:after="100" w:afterAutospacing="1" w:line="240" w:lineRule="auto"/>
+        <w:rPr>
+          <w:color w:val="000000"/>
+        </w:rPr>
+      </w:pPr>
+      <w:r>
+        <w:rPr>
+          <w:color w:val="000000"/>
+        </w:rPr>
+        <w:t>Suppose you have a smooth function (e.g., velocity field) sampled at some resolution.</w:t>
+      </w:r>
+    </w:p>
+    <w:p>
+      <w:pPr>
+        <w:numPr>
+          <w:ilvl w:val="0"/>
+          <w:numId w:val="16"/>
+        </w:numPr>
+        <w:spacing w:before="100" w:beforeAutospacing="1" w:after="100" w:afterAutospacing="1" w:line="240" w:lineRule="auto"/>
+        <w:rPr>
+          <w:color w:val="000000"/>
+        </w:rPr>
+      </w:pPr>
+      <w:r>
+        <w:rPr>
+          <w:color w:val="000000"/>
+        </w:rPr>
+        <w:t>Kolmogorov's work implies that the</w:t>
+      </w:r>
+      <w:r>
+        <w:rPr>
+          <w:rStyle w:val="apple-converted-space"/>
+          <w:color w:val="000000"/>
+        </w:rPr>
+        <w:t> </w:t>
+      </w:r>
+      <w:r>
+        <w:rPr>
+          <w:rStyle w:val="Strong"/>
+          <w:color w:val="000000"/>
+        </w:rPr>
+        <w:t>number of degrees of freedom</w:t>
+      </w:r>
+      <w:r>
+        <w:rPr>
+          <w:rStyle w:val="apple-converted-space"/>
+          <w:color w:val="000000"/>
+        </w:rPr>
+        <w:t> </w:t>
+      </w:r>
+      <w:r>
+        <w:rPr>
+          <w:color w:val="000000"/>
+        </w:rPr>
+        <w:t>required to describe it grows depending on the</w:t>
+      </w:r>
+      <w:r>
+        <w:rPr>
+          <w:rStyle w:val="apple-converted-space"/>
+          <w:color w:val="000000"/>
+        </w:rPr>
+        <w:t> </w:t>
+      </w:r>
+      <w:r>
+        <w:rPr>
+          <w:rStyle w:val="Emphasis"/>
+          <w:color w:val="000000"/>
+        </w:rPr>
+        <w:t>rate of decay</w:t>
+      </w:r>
+      <w:r>
+        <w:rPr>
+          <w:rStyle w:val="apple-converted-space"/>
+          <w:color w:val="000000"/>
+        </w:rPr>
+        <w:t> </w:t>
+      </w:r>
+      <w:r>
+        <w:rPr>
+          <w:color w:val="000000"/>
+        </w:rPr>
+        <w:t>of its spectrum (Fourier modes, singular values, etc.).</w:t>
+      </w:r>
+    </w:p>
+    <w:p>
+      <w:pPr>
+        <w:numPr>
+          <w:ilvl w:val="0"/>
+          <w:numId w:val="16"/>
+        </w:numPr>
+        <w:spacing w:before="100" w:beforeAutospacing="1" w:after="100" w:afterAutospacing="1" w:line="240" w:lineRule="auto"/>
+        <w:rPr>
+          <w:color w:val="000000"/>
+        </w:rPr>
+      </w:pPr>
+      <w:r>
+        <w:rPr>
+          <w:color w:val="000000"/>
+        </w:rPr>
+        <w:t>If the decay is slow (as it is in turbulence, chaotic flows, etc.),</w:t>
+      </w:r>
+      <w:r>
+        <w:rPr>
+          <w:rStyle w:val="apple-converted-space"/>
+          <w:color w:val="000000"/>
+        </w:rPr>
+        <w:t> </w:t>
+      </w:r>
+      <w:r>
+        <w:rPr>
+          <w:rStyle w:val="Strong"/>
+          <w:color w:val="000000"/>
+        </w:rPr>
+        <w:t>then even with the best methods, you can't reduce the data much without missing important structures</w:t>
+      </w:r>
+      <w:r>
+        <w:rPr>
+          <w:color w:val="000000"/>
+        </w:rPr>
+        <w:t>.</w:t>
+      </w:r>
+    </w:p>
+    <w:p>
+      <w:pPr>
+        <w:spacing w:before="100" w:beforeAutospacing="1" w:after="100" w:afterAutospacing="1"/>
+        <w:rPr>
+          <w:color w:val="000000"/>
+        </w:rPr>
+      </w:pPr>
+      <w:r>
+        <w:rPr>
+          <w:color w:val="000000"/>
+        </w:rPr>
+        <w:t>If you try to force more compression beyond the "Kolmogorov barrier," you'll get:</w:t>
+      </w:r>
+    </w:p>
+    <w:p>
+      <w:pPr>
+        <w:numPr>
+          <w:ilvl w:val="0"/>
+          <w:numId w:val="17"/>
+        </w:numPr>
+        <w:spacing w:before="100" w:beforeAutospacing="1" w:after="100" w:afterAutospacing="1" w:line="240" w:lineRule="auto"/>
+        <w:rPr>
+          <w:color w:val="000000"/>
+        </w:rPr>
+      </w:pPr>
+      <w:r>
+        <w:rPr>
+          <w:color w:val="000000"/>
+        </w:rPr>
+        <w:t>Unrealistic reconstructions,</w:t>
+      </w:r>
+    </w:p>
+    <w:p>
+      <w:pPr>
+        <w:numPr>
+          <w:ilvl w:val="0"/>
+          <w:numId w:val="17"/>
+        </w:numPr>
+        <w:spacing w:before="100" w:beforeAutospacing="1" w:after="100" w:afterAutospacing="1" w:line="240" w:lineRule="auto"/>
+        <w:rPr>
+          <w:color w:val="000000"/>
+        </w:rPr>
+      </w:pPr>
+      <w:r>
+        <w:rPr>
+          <w:color w:val="000000"/>
+        </w:rPr>
+        <w:t>Loss of small-scale but important features,</w:t>
+      </w:r>
+    </w:p>
+    <w:p>
+      <w:pPr>
+        <w:numPr>
+          <w:ilvl w:val="0"/>
+          <w:numId w:val="17"/>
+        </w:numPr>
+        <w:spacing w:before="100" w:beforeAutospacing="1" w:after="100" w:afterAutospacing="1" w:line="240" w:lineRule="auto"/>
+        <w:rPr>
+          <w:color w:val="000000"/>
+        </w:rPr>
+      </w:pPr>
+      <w:r>
+        <w:rPr>
+          <w:color w:val="000000"/>
+        </w:rPr>
+        <w:t>Degradation in predictive or physical accuracy.</w:t>
+      </w:r>
+    </w:p>
+    <w:p>
+      <w:pPr>
+        <w:spacing w:after="0"/>
+        <w:rPr>
+          <w:color w:val="auto"/>
+        </w:rPr>
+      </w:pPr>
+      <w:r>
+        <w:rPr>
+          <w:noProof/>
+        </w:rPr>
+        <w:pict w14:anchorId="094139EB">
+          <v:rect id="_x0000_i1027" alt="" style="width:468pt;height:.05pt;mso-width-percent:0;mso-height-percent:0;mso-width-percent:0;mso-height-percent:0" o:hralign="center" o:hrstd="t" o:hr="t" fillcolor="#a0a0a0" stroked="f"/>
+        </w:pict>
+      </w:r>
+    </w:p>
+    <w:p>
+      <w:pPr>
+        <w:pStyle w:val="Heading3"/>
+        <w:rPr>
+          <w:color w:val="000000"/>
+        </w:rPr>
+      </w:pPr>
+      <w:r>
+        <w:rPr>
+          <w:color w:val="000000"/>
+        </w:rPr>
+        <w:t>Example:</w:t>
+      </w:r>
+    </w:p>
+    <w:p>
+      <w:pPr>
+        <w:spacing w:before="100" w:beforeAutospacing="1" w:after="100" w:afterAutospacing="1"/>
+        <w:rPr>
+          <w:color w:val="000000"/>
+        </w:rPr>
+      </w:pPr>
+      <w:r>
+        <w:rPr>
+          <w:color w:val="000000"/>
+        </w:rPr>
+        <w:t>In turbulent fluid dynamics:</w:t>
+      </w:r>
+    </w:p>
+    <w:p>
+      <w:pPr>
+        <w:numPr>
+          <w:ilvl w:val="0"/>
+          <w:numId w:val="18"/>
+        </w:numPr>
+        <w:spacing w:before="100" w:beforeAutospacing="1" w:after="100" w:afterAutospacing="1" w:line="240" w:lineRule="auto"/>
+        <w:rPr>
+          <w:color w:val="000000"/>
+        </w:rPr>
+      </w:pPr>
+      <w:r>
+        <w:rPr>
+          <w:color w:val="000000"/>
+        </w:rPr>
+        <w:t>The Kolmogorov microscales describe the smallest scales where energy is dissipated.</w:t>
+      </w:r>
+    </w:p>
+    <w:p>
+      <w:pPr>
+        <w:numPr>
+          <w:ilvl w:val="0"/>
+          <w:numId w:val="18"/>
+        </w:numPr>
+        <w:spacing w:before="100" w:beforeAutospacing="1" w:after="100" w:afterAutospacing="1" w:line="240" w:lineRule="auto"/>
+        <w:rPr>
+          <w:color w:val="000000"/>
+        </w:rPr>
+      </w:pPr>
+      <w:r>
+        <w:rPr>
+          <w:color w:val="000000"/>
+        </w:rPr>
+        <w:t>If your model/compression ignores these scales, it will</w:t>
+      </w:r>
+      <w:r>
+        <w:rPr>
+          <w:rStyle w:val="apple-converted-space"/>
+          <w:color w:val="000000"/>
+        </w:rPr>
+        <w:t> </w:t>
+      </w:r>
+      <w:r>
+        <w:rPr>
+          <w:rStyle w:val="Strong"/>
+          <w:color w:val="000000"/>
+        </w:rPr>
+        <w:t>miss critical dissipation dynamics</w:t>
+      </w:r>
+      <w:r>
+        <w:rPr>
+          <w:rStyle w:val="apple-converted-space"/>
+          <w:color w:val="000000"/>
+        </w:rPr>
+        <w:t> </w:t>
+      </w:r>
+      <w:r>
+        <w:rPr>
+          <w:color w:val="000000"/>
+        </w:rPr>
+        <w:t>and be wrong.</w:t>
+      </w:r>
+    </w:p>
+    <w:p>
+      <w:pPr>
+        <w:spacing w:before="100" w:beforeAutospacing="1" w:after="100" w:afterAutospacing="1"/>
+        <w:rPr>
+          <w:color w:val="000000"/>
+        </w:rPr>
+      </w:pPr>
+      <w:r>
+        <w:rPr>
+          <w:color w:val="000000"/>
+        </w:rPr>
+        <w:lastRenderedPageBreak/>
+        <w:t>In reduced-order modeling:</w:t>
+      </w:r>
+    </w:p>
+    <w:p>
+      <w:pPr>
+        <w:numPr>
+          <w:ilvl w:val="0"/>
+          <w:numId w:val="19"/>
+        </w:numPr>
+        <w:spacing w:before="100" w:beforeAutospacing="1" w:after="100" w:afterAutospacing="1" w:line="240" w:lineRule="auto"/>
+        <w:rPr>
+          <w:color w:val="000000"/>
+        </w:rPr>
+      </w:pPr>
+      <w:r>
+        <w:rPr>
+          <w:color w:val="000000"/>
+        </w:rPr>
+        <w:t>The</w:t>
+      </w:r>
+      <w:r>
+        <w:rPr>
+          <w:rStyle w:val="apple-converted-space"/>
+          <w:color w:val="000000"/>
+        </w:rPr>
+        <w:t> </w:t>
+      </w:r>
+      <w:r>
+        <w:rPr>
+          <w:rStyle w:val="Strong"/>
+          <w:color w:val="000000"/>
+        </w:rPr>
+        <w:t>Kolmogorov</w:t>
+      </w:r>
+      <w:r>
+        <w:rPr>
+          <w:rStyle w:val="apple-converted-space"/>
+          <w:b/>
+          <w:bCs/>
+          <w:color w:val="000000"/>
+        </w:rPr>
+        <w:t> </w:t>
+      </w:r>
+      <w:proofErr w:type="spellStart"/>
+      <w:r>
+        <w:rPr>
+          <w:rStyle w:val="katex-mathml"/>
+          <w:b/>
+          <w:bCs/>
+          <w:color w:val="000000"/>
+        </w:rPr>
+        <w:t>n</w:t>
+      </w:r>
+      <w:r>
+        <w:rPr>
+          <w:rStyle w:val="mord"/>
+          <w:b/>
+          <w:bCs/>
+          <w:color w:val="000000"/>
+        </w:rPr>
+        <w:t>n</w:t>
+      </w:r>
+      <w:proofErr w:type="spellEnd"/>
+      <w:r>
+        <w:rPr>
+          <w:rStyle w:val="Strong"/>
+          <w:color w:val="000000"/>
+        </w:rPr>
+        <w:t>-width</w:t>
+      </w:r>
+      <w:r>
+        <w:rPr>
+          <w:rStyle w:val="apple-converted-space"/>
+          <w:color w:val="000000"/>
+        </w:rPr>
+        <w:t> </w:t>
+      </w:r>
+      <w:r>
+        <w:rPr>
+          <w:color w:val="000000"/>
+        </w:rPr>
+        <w:t>gives a formal measure of how well a set of functions can be approximated by an</w:t>
+      </w:r>
+      <w:r>
+        <w:rPr>
+          <w:rStyle w:val="apple-converted-space"/>
+          <w:color w:val="000000"/>
+        </w:rPr>
+        <w:t> </w:t>
+      </w:r>
+      <w:proofErr w:type="spellStart"/>
+      <w:r>
+        <w:rPr>
+          <w:rStyle w:val="katex-mathml"/>
+          <w:color w:val="000000"/>
+        </w:rPr>
+        <w:t>n</w:t>
+      </w:r>
+      <w:r>
+        <w:rPr>
+          <w:rStyle w:val="mord"/>
+          <w:color w:val="000000"/>
+        </w:rPr>
+        <w:t>n</w:t>
+      </w:r>
+      <w:proofErr w:type="spellEnd"/>
+      <w:r>
+        <w:rPr>
+          <w:color w:val="000000"/>
+        </w:rPr>
+        <w:t>-dimensional space.</w:t>
+      </w:r>
+    </w:p>
+    <w:p>
+      <w:pPr>
+        <w:numPr>
+          <w:ilvl w:val="0"/>
+          <w:numId w:val="19"/>
+        </w:numPr>
+        <w:spacing w:before="100" w:beforeAutospacing="1" w:after="100" w:afterAutospacing="1" w:line="240" w:lineRule="auto"/>
+        <w:rPr>
+          <w:color w:val="000000"/>
+        </w:rPr>
+      </w:pPr>
+      <w:r>
+        <w:rPr>
+          <w:color w:val="000000"/>
+        </w:rPr>
+        <w:t>A small Kolmogorov width means good compression is possible; a large width means the Kolmogorov barrier is high.</w:t>
+      </w:r>
+    </w:p>
+    <w:p>
+      <w:pPr>
+        <w:spacing w:after="0"/>
+        <w:rPr>
+          <w:color w:val="auto"/>
+        </w:rPr>
+      </w:pPr>
+      <w:r>
+        <w:rPr>
+          <w:noProof/>
+        </w:rPr>
+        <w:pict w14:anchorId="2657A59E">
+          <v:rect id="_x0000_i1026" alt="" style="width:468pt;height:.05pt;mso-width-percent:0;mso-height-percent:0;mso-width-percent:0;mso-height-percent:0" o:hralign="center" o:hrstd="t" o:hr="t" fillcolor="#a0a0a0" stroked="f"/>
+        </w:pict>
+      </w:r>
+    </w:p>
+    <w:p>
+      <w:pPr>
+        <w:pStyle w:val="Heading3"/>
+        <w:rPr>
+          <w:color w:val="000000"/>
+        </w:rPr>
+      </w:pPr>
+      <w:r>
+        <w:rPr>
+          <w:color w:val="000000"/>
+        </w:rPr>
+        <w:t>Quick Summary</w:t>
+      </w:r>
+    </w:p>
+    <w:tbl>
+      <w:tblPr>
+        <w:tblW w:w="0" w:type="auto"/>
+        <w:tblCellSpacing w:w="15" w:type="dxa"/>
+        <w:tblCellMar>
+          <w:top w:w="15" w:type="dxa"/>
+          <w:left w:w="15" w:type="dxa"/>
+          <w:bottom w:w="15" w:type="dxa"/>
+          <w:right w:w="15" w:type="dxa"/>
+        </w:tblCellMar>
+        <w:tblLook w:val="04A0" w:firstRow="1" w:lastRow="0" w:firstColumn="1" w:lastColumn="0" w:noHBand="0" w:noVBand="1"/>
+      </w:tblPr>
+      <w:tblGrid>
+        <w:gridCol w:w="2135"/>
+        <w:gridCol w:w="7225"/>
+      </w:tblGrid>
+      <w:tr>
+        <w:trPr>
+          <w:tblHeader/>
+          <w:tblCellSpacing w:w="15" w:type="dxa"/>
+        </w:trPr>
+        <w:tc>
+          <w:tcPr>
+            <w:tcW w:w="0" w:type="auto"/>
+            <w:vAlign w:val="center"/>
+            <w:hideMark/>
+          </w:tcPr>
+          <w:p>
+            <w:pPr>
+              <w:jc w:val="center"/>
+              <w:rPr>
+                <w:b/>
+                <w:bCs/>
+                <w:color w:val="auto"/>
+              </w:rPr>
+            </w:pPr>
+            <w:r>
+              <w:rPr>
+                <w:b/>
+                <w:bCs/>
+              </w:rPr>
+              <w:t>Aspect</w:t>
+            </w:r>
+          </w:p>
+        </w:tc>
+        <w:tc>
+          <w:tcPr>
+            <w:tcW w:w="0" w:type="auto"/>
+            <w:vAlign w:val="center"/>
+            <w:hideMark/>
+          </w:tcPr>
+          <w:p>
+            <w:pPr>
+              <w:jc w:val="center"/>
+              <w:rPr>
+                <w:b/>
+                <w:bCs/>
+              </w:rPr>
+            </w:pPr>
+            <w:r>
+              <w:rPr>
+                <w:b/>
+                <w:bCs/>
+              </w:rPr>
+              <w:t>Kolmogorov Barrier</w:t>
+            </w:r>
+          </w:p>
+        </w:tc>
+      </w:tr>
+      <w:tr>
+        <w:trPr>
+          <w:tblCellSpacing w:w="15" w:type="dxa"/>
+        </w:trPr>
+        <w:tc>
+          <w:tcPr>
+            <w:tcW w:w="0" w:type="auto"/>
+            <w:vAlign w:val="center"/>
+            <w:hideMark/>
+          </w:tcPr>
+          <w:p>
+            <w:r>
+              <w:t>What it is</w:t>
+            </w:r>
+          </w:p>
+        </w:tc>
+        <w:tc>
+          <w:tcPr>
+            <w:tcW w:w="0" w:type="auto"/>
+            <w:vAlign w:val="center"/>
+            <w:hideMark/>
+          </w:tcPr>
+          <w:p>
+            <w:r>
+              <w:t>A theoretical limit on compressibility or dimension reduction of complex systems</w:t>
+            </w:r>
+          </w:p>
+        </w:tc>
+      </w:tr>
+      <w:tr>
+        <w:trPr>
+          <w:tblCellSpacing w:w="15" w:type="dxa"/>
+        </w:trPr>
+        <w:tc>
+          <w:tcPr>
+            <w:tcW w:w="0" w:type="auto"/>
+            <w:vAlign w:val="center"/>
+            <w:hideMark/>
+          </w:tcPr>
+          <w:p>
+            <w:r>
+              <w:t>Why it matters</w:t>
+            </w:r>
+          </w:p>
+        </w:tc>
+        <w:tc>
+          <w:tcPr>
+            <w:tcW w:w="0" w:type="auto"/>
+            <w:vAlign w:val="center"/>
+            <w:hideMark/>
+          </w:tcPr>
+          <w:p>
+            <w:r>
+              <w:t>Crossing it leads to loss of essential information</w:t>
+            </w:r>
+          </w:p>
+        </w:tc>
+      </w:tr>
+      <w:tr>
+        <w:trPr>
+          <w:tblCellSpacing w:w="15" w:type="dxa"/>
+        </w:trPr>
+        <w:tc>
+          <w:tcPr>
+            <w:tcW w:w="0" w:type="auto"/>
+            <w:vAlign w:val="center"/>
+            <w:hideMark/>
+          </w:tcPr>
+          <w:p>
+            <w:r>
+              <w:t>Related concepts</w:t>
+            </w:r>
+          </w:p>
+        </w:tc>
+        <w:tc>
+          <w:tcPr>
+            <w:tcW w:w="0" w:type="auto"/>
+            <w:vAlign w:val="center"/>
+            <w:hideMark/>
+          </w:tcPr>
+          <w:p>
+            <w:r>
+              <w:t>Kolmogorov complexity, Kolmogorov entropy, Kolmogorov</w:t>
+            </w:r>
+            <w:r>
+              <w:rPr>
+                <w:rStyle w:val="apple-converted-space"/>
+              </w:rPr>
+              <w:t> </w:t>
+            </w:r>
+            <w:proofErr w:type="spellStart"/>
+            <w:r>
+              <w:rPr>
+                <w:rStyle w:val="katex-mathml"/>
+              </w:rPr>
+              <w:t>n</w:t>
+            </w:r>
+            <w:r>
+              <w:rPr>
+                <w:rStyle w:val="mord"/>
+              </w:rPr>
+              <w:t>n</w:t>
+            </w:r>
+            <w:proofErr w:type="spellEnd"/>
+            <w:r>
+              <w:t>-width</w:t>
+            </w:r>
+          </w:p>
+        </w:tc>
+      </w:tr>
+      <w:tr>
+        <w:trPr>
+          <w:tblCellSpacing w:w="15" w:type="dxa"/>
+        </w:trPr>
+        <w:tc>
+          <w:tcPr>
+            <w:tcW w:w="0" w:type="auto"/>
+            <w:vAlign w:val="center"/>
+            <w:hideMark/>
+          </w:tcPr>
+          <w:p>
+            <w:r>
+              <w:t>Shows up in</w:t>
+            </w:r>
+          </w:p>
+        </w:tc>
+        <w:tc>
+          <w:tcPr>
+            <w:tcW w:w="0" w:type="auto"/>
+            <w:vAlign w:val="center"/>
+            <w:hideMark/>
+          </w:tcPr>
+          <w:p>
+            <w:r>
+              <w:t>Fluid dynamics, machine learning, reduced-order modeling, turbulence</w:t>
+            </w:r>
+          </w:p>
+        </w:tc>
+      </w:tr>
+      <w:tr>
+        <w:trPr>
+          <w:tblCellSpacing w:w="15" w:type="dxa"/>
+        </w:trPr>
+        <w:tc>
+          <w:tcPr>
+            <w:tcW w:w="0" w:type="auto"/>
+            <w:vAlign w:val="center"/>
+            <w:hideMark/>
+          </w:tcPr>
+          <w:p>
+            <w:r>
+              <w:t>Practical consequence</w:t>
+            </w:r>
+          </w:p>
+        </w:tc>
+        <w:tc>
+          <w:tcPr>
+            <w:tcW w:w="0" w:type="auto"/>
+            <w:vAlign w:val="center"/>
+            <w:hideMark/>
+          </w:tcPr>
+          <w:p>
+            <w:r>
+              <w:t>There’s a hard minimum for how much you can compress chaotic or complex systems without losing important behavior</w:t>
+            </w:r>
+          </w:p>
+        </w:tc>
+      </w:tr>
+    </w:tbl>
+    <w:p>
+      <w:pPr>
+        <w:rPr>
+          <w:color w:val="auto"/>
+        </w:rPr>
+      </w:pPr>
+      <w:r>
+        <w:rPr>
+          <w:noProof/>
+        </w:rPr>
+        <w:pict w14:anchorId="0B796F8D">
+          <v:rect id="_x0000_i1025" alt="" style="width:468pt;height:.05pt;mso-width-percent:0;mso-height-percent:0;mso-width-percent:0;mso-height-percent:0" o:hralign="center" o:hrstd="t" o:hr="t" fillcolor="#a0a0a0" stroked="f"/>
+        </w:pict>
+      </w:r>
+    </w:p>
+    <w:p>
+      <w:pPr>
+        <w:spacing w:before="100" w:beforeAutospacing="1" w:after="100" w:afterAutospacing="1"/>
+        <w:rPr>
+          <w:color w:val="000000"/>
+        </w:rPr>
+      </w:pPr>
+      <w:r>
+        <w:rPr>
+          <w:color w:val="000000"/>
+        </w:rPr>
+        <w:t>Would you also like me to show you</w:t>
+      </w:r>
+      <w:r>
+        <w:rPr>
+          <w:rStyle w:val="apple-converted-space"/>
+          <w:color w:val="000000"/>
+        </w:rPr>
+        <w:t> </w:t>
+      </w:r>
+      <w:r>
+        <w:rPr>
+          <w:rStyle w:val="Strong"/>
+          <w:color w:val="000000"/>
+        </w:rPr>
+        <w:t>a diagram</w:t>
+      </w:r>
+      <w:r>
+        <w:rPr>
+          <w:rStyle w:val="apple-converted-space"/>
+          <w:color w:val="000000"/>
+        </w:rPr>
+        <w:t> </w:t>
+      </w:r>
+      <w:r>
+        <w:rPr>
+          <w:color w:val="000000"/>
+        </w:rPr>
+        <w:t>or</w:t>
+      </w:r>
+      <w:r>
+        <w:rPr>
+          <w:rStyle w:val="apple-converted-space"/>
+          <w:color w:val="000000"/>
+        </w:rPr>
+        <w:t> </w:t>
+      </w:r>
+      <w:r>
+        <w:rPr>
+          <w:rStyle w:val="Strong"/>
+          <w:color w:val="000000"/>
+        </w:rPr>
+        <w:t>a small code example</w:t>
+      </w:r>
+      <w:r>
+        <w:rPr>
+          <w:rStyle w:val="apple-converted-space"/>
+          <w:color w:val="000000"/>
+        </w:rPr>
+        <w:t> </w:t>
+      </w:r>
+      <w:r>
+        <w:rPr>
+          <w:color w:val="000000"/>
+        </w:rPr>
+        <w:t xml:space="preserve">that visually shows a signal being compressed and where the "barrier" kicks in? </w:t>
+      </w:r>
+      <w:r>
+        <w:rPr>
+          <w:rFonts w:ascii="Apple Color Emoji" w:hAnsi="Apple Color Emoji" w:cs="Apple Color Emoji"/>
+          <w:color w:val="000000"/>
+        </w:rPr>
+        <w:t>🚀</w:t>
+      </w:r>
+      <w:r>
+        <w:rPr>
+          <w:color w:val="000000"/>
+        </w:rPr>
+        <w:br/>
+        <w:t>It makes the concept even clearer!</w:t>
+      </w:r>
+    </w:p>
     <w:p/>
     <w:p/>
     <w:p/>
@@ -5457,6 +6501,304 @@
     </w:lvl>
   </w:abstractNum>
   <w:abstractNum w:abstractNumId="2" w15:restartNumberingAfterBreak="0">
+    <w:nsid w:val="0B7401FD"/>
+    <w:multiLevelType w:val="multilevel"/>
+    <w:tmpl w:val="EFCA9B1E"/>
+    <w:lvl w:ilvl="0">
+      <w:start w:val="1"/>
+      <w:numFmt w:val="bullet"/>
+      <w:lvlText w:val=""/>
+      <w:lvlJc w:val="left"/>
+      <w:pPr>
+        <w:tabs>
+          <w:tab w:val="num" w:pos="720"/>
+        </w:tabs>
+        <w:ind w:left="720" w:hanging="360"/>
+      </w:pPr>
+      <w:rPr>
+        <w:rFonts w:ascii="Symbol" w:hAnsi="Symbol" w:hint="default"/>
+        <w:sz w:val="20"/>
+      </w:rPr>
+    </w:lvl>
+    <w:lvl w:ilvl="1" w:tentative="1">
+      <w:start w:val="1"/>
+      <w:numFmt w:val="bullet"/>
+      <w:lvlText w:val="o"/>
+      <w:lvlJc w:val="left"/>
+      <w:pPr>
+        <w:tabs>
+          <w:tab w:val="num" w:pos="1440"/>
+        </w:tabs>
+        <w:ind w:left="1440" w:hanging="360"/>
+      </w:pPr>
+      <w:rPr>
+        <w:rFonts w:ascii="Courier New" w:hAnsi="Courier New" w:hint="default"/>
+        <w:sz w:val="20"/>
+      </w:rPr>
+    </w:lvl>
+    <w:lvl w:ilvl="2" w:tentative="1">
+      <w:start w:val="1"/>
+      <w:numFmt w:val="bullet"/>
+      <w:lvlText w:val=""/>
+      <w:lvlJc w:val="left"/>
+      <w:pPr>
+        <w:tabs>
+          <w:tab w:val="num" w:pos="2160"/>
+        </w:tabs>
+        <w:ind w:left="2160" w:hanging="360"/>
+      </w:pPr>
+      <w:rPr>
+        <w:rFonts w:ascii="Wingdings" w:hAnsi="Wingdings" w:hint="default"/>
+        <w:sz w:val="20"/>
+      </w:rPr>
+    </w:lvl>
+    <w:lvl w:ilvl="3" w:tentative="1">
+      <w:start w:val="1"/>
+      <w:numFmt w:val="bullet"/>
+      <w:lvlText w:val=""/>
+      <w:lvlJc w:val="left"/>
+      <w:pPr>
+        <w:tabs>
+          <w:tab w:val="num" w:pos="2880"/>
+        </w:tabs>
+        <w:ind w:left="2880" w:hanging="360"/>
+      </w:pPr>
+      <w:rPr>
+        <w:rFonts w:ascii="Wingdings" w:hAnsi="Wingdings" w:hint="default"/>
+        <w:sz w:val="20"/>
+      </w:rPr>
+    </w:lvl>
+    <w:lvl w:ilvl="4" w:tentative="1">
+      <w:start w:val="1"/>
+      <w:numFmt w:val="bullet"/>
+      <w:lvlText w:val=""/>
+      <w:lvlJc w:val="left"/>
+      <w:pPr>
+        <w:tabs>
+          <w:tab w:val="num" w:pos="3600"/>
+        </w:tabs>
+        <w:ind w:left="3600" w:hanging="360"/>
+      </w:pPr>
+      <w:rPr>
+        <w:rFonts w:ascii="Wingdings" w:hAnsi="Wingdings" w:hint="default"/>
+        <w:sz w:val="20"/>
+      </w:rPr>
+    </w:lvl>
+    <w:lvl w:ilvl="5" w:tentative="1">
+      <w:start w:val="1"/>
+      <w:numFmt w:val="bullet"/>
+      <w:lvlText w:val=""/>
+      <w:lvlJc w:val="left"/>
+      <w:pPr>
+        <w:tabs>
+          <w:tab w:val="num" w:pos="4320"/>
+        </w:tabs>
+        <w:ind w:left="4320" w:hanging="360"/>
+      </w:pPr>
+      <w:rPr>
+        <w:rFonts w:ascii="Wingdings" w:hAnsi="Wingdings" w:hint="default"/>
+        <w:sz w:val="20"/>
+      </w:rPr>
+    </w:lvl>
+    <w:lvl w:ilvl="6" w:tentative="1">
+      <w:start w:val="1"/>
+      <w:numFmt w:val="bullet"/>
+      <w:lvlText w:val=""/>
+      <w:lvlJc w:val="left"/>
+      <w:pPr>
+        <w:tabs>
+          <w:tab w:val="num" w:pos="5040"/>
+        </w:tabs>
+        <w:ind w:left="5040" w:hanging="360"/>
+      </w:pPr>
+      <w:rPr>
+        <w:rFonts w:ascii="Wingdings" w:hAnsi="Wingdings" w:hint="default"/>
+        <w:sz w:val="20"/>
+      </w:rPr>
+    </w:lvl>
+    <w:lvl w:ilvl="7" w:tentative="1">
+      <w:start w:val="1"/>
+      <w:numFmt w:val="bullet"/>
+      <w:lvlText w:val=""/>
+      <w:lvlJc w:val="left"/>
+      <w:pPr>
+        <w:tabs>
+          <w:tab w:val="num" w:pos="5760"/>
+        </w:tabs>
+        <w:ind w:left="5760" w:hanging="360"/>
+      </w:pPr>
+      <w:rPr>
+        <w:rFonts w:ascii="Wingdings" w:hAnsi="Wingdings" w:hint="default"/>
+        <w:sz w:val="20"/>
+      </w:rPr>
+    </w:lvl>
+    <w:lvl w:ilvl="8" w:tentative="1">
+      <w:start w:val="1"/>
+      <w:numFmt w:val="bullet"/>
+      <w:lvlText w:val=""/>
+      <w:lvlJc w:val="left"/>
+      <w:pPr>
+        <w:tabs>
+          <w:tab w:val="num" w:pos="6480"/>
+        </w:tabs>
+        <w:ind w:left="6480" w:hanging="360"/>
+      </w:pPr>
+      <w:rPr>
+        <w:rFonts w:ascii="Wingdings" w:hAnsi="Wingdings" w:hint="default"/>
+        <w:sz w:val="20"/>
+      </w:rPr>
+    </w:lvl>
+  </w:abstractNum>
+  <w:abstractNum w:abstractNumId="3" w15:restartNumberingAfterBreak="0">
+    <w:nsid w:val="0B7C3945"/>
+    <w:multiLevelType w:val="multilevel"/>
+    <w:tmpl w:val="818C6B4C"/>
+    <w:lvl w:ilvl="0">
+      <w:start w:val="1"/>
+      <w:numFmt w:val="bullet"/>
+      <w:lvlText w:val=""/>
+      <w:lvlJc w:val="left"/>
+      <w:pPr>
+        <w:tabs>
+          <w:tab w:val="num" w:pos="720"/>
+        </w:tabs>
+        <w:ind w:left="720" w:hanging="360"/>
+      </w:pPr>
+      <w:rPr>
+        <w:rFonts w:ascii="Symbol" w:hAnsi="Symbol" w:hint="default"/>
+        <w:sz w:val="20"/>
+      </w:rPr>
+    </w:lvl>
+    <w:lvl w:ilvl="1" w:tentative="1">
+      <w:start w:val="1"/>
+      <w:numFmt w:val="bullet"/>
+      <w:lvlText w:val="o"/>
+      <w:lvlJc w:val="left"/>
+      <w:pPr>
+        <w:tabs>
+          <w:tab w:val="num" w:pos="1440"/>
+        </w:tabs>
+        <w:ind w:left="1440" w:hanging="360"/>
+      </w:pPr>
+      <w:rPr>
+        <w:rFonts w:ascii="Courier New" w:hAnsi="Courier New" w:hint="default"/>
+        <w:sz w:val="20"/>
+      </w:rPr>
+    </w:lvl>
+    <w:lvl w:ilvl="2" w:tentative="1">
+      <w:start w:val="1"/>
+      <w:numFmt w:val="bullet"/>
+      <w:lvlText w:val=""/>
+      <w:lvlJc w:val="left"/>
+      <w:pPr>
+        <w:tabs>
+          <w:tab w:val="num" w:pos="2160"/>
+        </w:tabs>
+        <w:ind w:left="2160" w:hanging="360"/>
+      </w:pPr>
+      <w:rPr>
+        <w:rFonts w:ascii="Wingdings" w:hAnsi="Wingdings" w:hint="default"/>
+        <w:sz w:val="20"/>
+      </w:rPr>
+    </w:lvl>
+    <w:lvl w:ilvl="3" w:tentative="1">
+      <w:start w:val="1"/>
+      <w:numFmt w:val="bullet"/>
+      <w:lvlText w:val=""/>
+      <w:lvlJc w:val="left"/>
+      <w:pPr>
+        <w:tabs>
+          <w:tab w:val="num" w:pos="2880"/>
+        </w:tabs>
+        <w:ind w:left="2880" w:hanging="360"/>
+      </w:pPr>
+      <w:rPr>
+        <w:rFonts w:ascii="Wingdings" w:hAnsi="Wingdings" w:hint="default"/>
+        <w:sz w:val="20"/>
+      </w:rPr>
+    </w:lvl>
+    <w:lvl w:ilvl="4" w:tentative="1">
+      <w:start w:val="1"/>
+      <w:numFmt w:val="bullet"/>
+      <w:lvlText w:val=""/>
+      <w:lvlJc w:val="left"/>
+      <w:pPr>
+        <w:tabs>
+          <w:tab w:val="num" w:pos="3600"/>
+        </w:tabs>
+        <w:ind w:left="3600" w:hanging="360"/>
+      </w:pPr>
+      <w:rPr>
+        <w:rFonts w:ascii="Wingdings" w:hAnsi="Wingdings" w:hint="default"/>
+        <w:sz w:val="20"/>
+      </w:rPr>
+    </w:lvl>
+    <w:lvl w:ilvl="5" w:tentative="1">
+      <w:start w:val="1"/>
+      <w:numFmt w:val="bullet"/>
+      <w:lvlText w:val=""/>
+      <w:lvlJc w:val="left"/>
+      <w:pPr>
+        <w:tabs>
+          <w:tab w:val="num" w:pos="4320"/>
+        </w:tabs>
+        <w:ind w:left="4320" w:hanging="360"/>
+      </w:pPr>
+      <w:rPr>
+        <w:rFonts w:ascii="Wingdings" w:hAnsi="Wingdings" w:hint="default"/>
+        <w:sz w:val="20"/>
+      </w:rPr>
+    </w:lvl>
+    <w:lvl w:ilvl="6" w:tentative="1">
+      <w:start w:val="1"/>
+      <w:numFmt w:val="bullet"/>
+      <w:lvlText w:val=""/>
+      <w:lvlJc w:val="left"/>
+      <w:pPr>
+        <w:tabs>
+          <w:tab w:val="num" w:pos="5040"/>
+        </w:tabs>
+        <w:ind w:left="5040" w:hanging="360"/>
+      </w:pPr>
+      <w:rPr>
+        <w:rFonts w:ascii="Wingdings" w:hAnsi="Wingdings" w:hint="default"/>
+        <w:sz w:val="20"/>
+      </w:rPr>
+    </w:lvl>
+    <w:lvl w:ilvl="7" w:tentative="1">
+      <w:start w:val="1"/>
+      <w:numFmt w:val="bullet"/>
+      <w:lvlText w:val=""/>
+      <w:lvlJc w:val="left"/>
+      <w:pPr>
+        <w:tabs>
+          <w:tab w:val="num" w:pos="5760"/>
+        </w:tabs>
+        <w:ind w:left="5760" w:hanging="360"/>
+      </w:pPr>
+      <w:rPr>
+        <w:rFonts w:ascii="Wingdings" w:hAnsi="Wingdings" w:hint="default"/>
+        <w:sz w:val="20"/>
+      </w:rPr>
+    </w:lvl>
+    <w:lvl w:ilvl="8" w:tentative="1">
+      <w:start w:val="1"/>
+      <w:numFmt w:val="bullet"/>
+      <w:lvlText w:val=""/>
+      <w:lvlJc w:val="left"/>
+      <w:pPr>
+        <w:tabs>
+          <w:tab w:val="num" w:pos="6480"/>
+        </w:tabs>
+        <w:ind w:left="6480" w:hanging="360"/>
+      </w:pPr>
+      <w:rPr>
+        <w:rFonts w:ascii="Wingdings" w:hAnsi="Wingdings" w:hint="default"/>
+        <w:sz w:val="20"/>
+      </w:rPr>
+    </w:lvl>
+  </w:abstractNum>
+  <w:abstractNum w:abstractNumId="4" w15:restartNumberingAfterBreak="0">
     <w:nsid w:val="1A240279"/>
     <w:multiLevelType w:val="hybridMultilevel"/>
     <w:tmpl w:val="8340C82A"/>
@@ -5542,7 +6884,7 @@
       </w:pPr>
     </w:lvl>
   </w:abstractNum>
-  <w:abstractNum w:abstractNumId="3" w15:restartNumberingAfterBreak="0">
+  <w:abstractNum w:abstractNumId="5" w15:restartNumberingAfterBreak="0">
     <w:nsid w:val="20906CDF"/>
     <w:multiLevelType w:val="hybridMultilevel"/>
     <w:tmpl w:val="9E244A1C"/>
@@ -5659,7 +7001,7 @@
       </w:rPr>
     </w:lvl>
   </w:abstractNum>
-  <w:abstractNum w:abstractNumId="4" w15:restartNumberingAfterBreak="0">
+  <w:abstractNum w:abstractNumId="6" w15:restartNumberingAfterBreak="0">
     <w:nsid w:val="26A7112E"/>
     <w:multiLevelType w:val="hybridMultilevel"/>
     <w:tmpl w:val="63F07134"/>
@@ -5745,7 +7087,7 @@
       </w:pPr>
     </w:lvl>
   </w:abstractNum>
-  <w:abstractNum w:abstractNumId="5" w15:restartNumberingAfterBreak="0">
+  <w:abstractNum w:abstractNumId="7" w15:restartNumberingAfterBreak="0">
     <w:nsid w:val="2EFE122C"/>
     <w:multiLevelType w:val="hybridMultilevel"/>
     <w:tmpl w:val="86D8B5F2"/>
@@ -5831,7 +7173,305 @@
       </w:pPr>
     </w:lvl>
   </w:abstractNum>
-  <w:abstractNum w:abstractNumId="6" w15:restartNumberingAfterBreak="0">
+  <w:abstractNum w:abstractNumId="8" w15:restartNumberingAfterBreak="0">
+    <w:nsid w:val="34A2691D"/>
+    <w:multiLevelType w:val="multilevel"/>
+    <w:tmpl w:val="9C4452A0"/>
+    <w:lvl w:ilvl="0">
+      <w:start w:val="1"/>
+      <w:numFmt w:val="bullet"/>
+      <w:lvlText w:val=""/>
+      <w:lvlJc w:val="left"/>
+      <w:pPr>
+        <w:tabs>
+          <w:tab w:val="num" w:pos="720"/>
+        </w:tabs>
+        <w:ind w:left="720" w:hanging="360"/>
+      </w:pPr>
+      <w:rPr>
+        <w:rFonts w:ascii="Symbol" w:hAnsi="Symbol" w:hint="default"/>
+        <w:sz w:val="20"/>
+      </w:rPr>
+    </w:lvl>
+    <w:lvl w:ilvl="1" w:tentative="1">
+      <w:start w:val="1"/>
+      <w:numFmt w:val="bullet"/>
+      <w:lvlText w:val="o"/>
+      <w:lvlJc w:val="left"/>
+      <w:pPr>
+        <w:tabs>
+          <w:tab w:val="num" w:pos="1440"/>
+        </w:tabs>
+        <w:ind w:left="1440" w:hanging="360"/>
+      </w:pPr>
+      <w:rPr>
+        <w:rFonts w:ascii="Courier New" w:hAnsi="Courier New" w:hint="default"/>
+        <w:sz w:val="20"/>
+      </w:rPr>
+    </w:lvl>
+    <w:lvl w:ilvl="2" w:tentative="1">
+      <w:start w:val="1"/>
+      <w:numFmt w:val="bullet"/>
+      <w:lvlText w:val=""/>
+      <w:lvlJc w:val="left"/>
+      <w:pPr>
+        <w:tabs>
+          <w:tab w:val="num" w:pos="2160"/>
+        </w:tabs>
+        <w:ind w:left="2160" w:hanging="360"/>
+      </w:pPr>
+      <w:rPr>
+        <w:rFonts w:ascii="Wingdings" w:hAnsi="Wingdings" w:hint="default"/>
+        <w:sz w:val="20"/>
+      </w:rPr>
+    </w:lvl>
+    <w:lvl w:ilvl="3" w:tentative="1">
+      <w:start w:val="1"/>
+      <w:numFmt w:val="bullet"/>
+      <w:lvlText w:val=""/>
+      <w:lvlJc w:val="left"/>
+      <w:pPr>
+        <w:tabs>
+          <w:tab w:val="num" w:pos="2880"/>
+        </w:tabs>
+        <w:ind w:left="2880" w:hanging="360"/>
+      </w:pPr>
+      <w:rPr>
+        <w:rFonts w:ascii="Wingdings" w:hAnsi="Wingdings" w:hint="default"/>
+        <w:sz w:val="20"/>
+      </w:rPr>
+    </w:lvl>
+    <w:lvl w:ilvl="4" w:tentative="1">
+      <w:start w:val="1"/>
+      <w:numFmt w:val="bullet"/>
+      <w:lvlText w:val=""/>
+      <w:lvlJc w:val="left"/>
+      <w:pPr>
+        <w:tabs>
+          <w:tab w:val="num" w:pos="3600"/>
+        </w:tabs>
+        <w:ind w:left="3600" w:hanging="360"/>
+      </w:pPr>
+      <w:rPr>
+        <w:rFonts w:ascii="Wingdings" w:hAnsi="Wingdings" w:hint="default"/>
+        <w:sz w:val="20"/>
+      </w:rPr>
+    </w:lvl>
+    <w:lvl w:ilvl="5" w:tentative="1">
+      <w:start w:val="1"/>
+      <w:numFmt w:val="bullet"/>
+      <w:lvlText w:val=""/>
+      <w:lvlJc w:val="left"/>
+      <w:pPr>
+        <w:tabs>
+          <w:tab w:val="num" w:pos="4320"/>
+        </w:tabs>
+        <w:ind w:left="4320" w:hanging="360"/>
+      </w:pPr>
+      <w:rPr>
+        <w:rFonts w:ascii="Wingdings" w:hAnsi="Wingdings" w:hint="default"/>
+        <w:sz w:val="20"/>
+      </w:rPr>
+    </w:lvl>
+    <w:lvl w:ilvl="6" w:tentative="1">
+      <w:start w:val="1"/>
+      <w:numFmt w:val="bullet"/>
+      <w:lvlText w:val=""/>
+      <w:lvlJc w:val="left"/>
+      <w:pPr>
+        <w:tabs>
+          <w:tab w:val="num" w:pos="5040"/>
+        </w:tabs>
+        <w:ind w:left="5040" w:hanging="360"/>
+      </w:pPr>
+      <w:rPr>
+        <w:rFonts w:ascii="Wingdings" w:hAnsi="Wingdings" w:hint="default"/>
+        <w:sz w:val="20"/>
+      </w:rPr>
+    </w:lvl>
+    <w:lvl w:ilvl="7" w:tentative="1">
+      <w:start w:val="1"/>
+      <w:numFmt w:val="bullet"/>
+      <w:lvlText w:val=""/>
+      <w:lvlJc w:val="left"/>
+      <w:pPr>
+        <w:tabs>
+          <w:tab w:val="num" w:pos="5760"/>
+        </w:tabs>
+        <w:ind w:left="5760" w:hanging="360"/>
+      </w:pPr>
+      <w:rPr>
+        <w:rFonts w:ascii="Wingdings" w:hAnsi="Wingdings" w:hint="default"/>
+        <w:sz w:val="20"/>
+      </w:rPr>
+    </w:lvl>
+    <w:lvl w:ilvl="8" w:tentative="1">
+      <w:start w:val="1"/>
+      <w:numFmt w:val="bullet"/>
+      <w:lvlText w:val=""/>
+      <w:lvlJc w:val="left"/>
+      <w:pPr>
+        <w:tabs>
+          <w:tab w:val="num" w:pos="6480"/>
+        </w:tabs>
+        <w:ind w:left="6480" w:hanging="360"/>
+      </w:pPr>
+      <w:rPr>
+        <w:rFonts w:ascii="Wingdings" w:hAnsi="Wingdings" w:hint="default"/>
+        <w:sz w:val="20"/>
+      </w:rPr>
+    </w:lvl>
+  </w:abstractNum>
+  <w:abstractNum w:abstractNumId="9" w15:restartNumberingAfterBreak="0">
+    <w:nsid w:val="48047AB5"/>
+    <w:multiLevelType w:val="multilevel"/>
+    <w:tmpl w:val="7B889450"/>
+    <w:lvl w:ilvl="0">
+      <w:start w:val="1"/>
+      <w:numFmt w:val="bullet"/>
+      <w:lvlText w:val=""/>
+      <w:lvlJc w:val="left"/>
+      <w:pPr>
+        <w:tabs>
+          <w:tab w:val="num" w:pos="720"/>
+        </w:tabs>
+        <w:ind w:left="720" w:hanging="360"/>
+      </w:pPr>
+      <w:rPr>
+        <w:rFonts w:ascii="Symbol" w:hAnsi="Symbol" w:hint="default"/>
+        <w:sz w:val="20"/>
+      </w:rPr>
+    </w:lvl>
+    <w:lvl w:ilvl="1" w:tentative="1">
+      <w:start w:val="1"/>
+      <w:numFmt w:val="bullet"/>
+      <w:lvlText w:val="o"/>
+      <w:lvlJc w:val="left"/>
+      <w:pPr>
+        <w:tabs>
+          <w:tab w:val="num" w:pos="1440"/>
+        </w:tabs>
+        <w:ind w:left="1440" w:hanging="360"/>
+      </w:pPr>
+      <w:rPr>
+        <w:rFonts w:ascii="Courier New" w:hAnsi="Courier New" w:hint="default"/>
+        <w:sz w:val="20"/>
+      </w:rPr>
+    </w:lvl>
+    <w:lvl w:ilvl="2" w:tentative="1">
+      <w:start w:val="1"/>
+      <w:numFmt w:val="bullet"/>
+      <w:lvlText w:val=""/>
+      <w:lvlJc w:val="left"/>
+      <w:pPr>
+        <w:tabs>
+          <w:tab w:val="num" w:pos="2160"/>
+        </w:tabs>
+        <w:ind w:left="2160" w:hanging="360"/>
+      </w:pPr>
+      <w:rPr>
+        <w:rFonts w:ascii="Wingdings" w:hAnsi="Wingdings" w:hint="default"/>
+        <w:sz w:val="20"/>
+      </w:rPr>
+    </w:lvl>
+    <w:lvl w:ilvl="3" w:tentative="1">
+      <w:start w:val="1"/>
+      <w:numFmt w:val="bullet"/>
+      <w:lvlText w:val=""/>
+      <w:lvlJc w:val="left"/>
+      <w:pPr>
+        <w:tabs>
+          <w:tab w:val="num" w:pos="2880"/>
+        </w:tabs>
+        <w:ind w:left="2880" w:hanging="360"/>
+      </w:pPr>
+      <w:rPr>
+        <w:rFonts w:ascii="Wingdings" w:hAnsi="Wingdings" w:hint="default"/>
+        <w:sz w:val="20"/>
+      </w:rPr>
+    </w:lvl>
+    <w:lvl w:ilvl="4" w:tentative="1">
+      <w:start w:val="1"/>
+      <w:numFmt w:val="bullet"/>
+      <w:lvlText w:val=""/>
+      <w:lvlJc w:val="left"/>
+      <w:pPr>
+        <w:tabs>
+          <w:tab w:val="num" w:pos="3600"/>
+        </w:tabs>
+        <w:ind w:left="3600" w:hanging="360"/>
+      </w:pPr>
+      <w:rPr>
+        <w:rFonts w:ascii="Wingdings" w:hAnsi="Wingdings" w:hint="default"/>
+        <w:sz w:val="20"/>
+      </w:rPr>
+    </w:lvl>
+    <w:lvl w:ilvl="5" w:tentative="1">
+      <w:start w:val="1"/>
+      <w:numFmt w:val="bullet"/>
+      <w:lvlText w:val=""/>
+      <w:lvlJc w:val="left"/>
+      <w:pPr>
+        <w:tabs>
+          <w:tab w:val="num" w:pos="4320"/>
+        </w:tabs>
+        <w:ind w:left="4320" w:hanging="360"/>
+      </w:pPr>
+      <w:rPr>
+        <w:rFonts w:ascii="Wingdings" w:hAnsi="Wingdings" w:hint="default"/>
+        <w:sz w:val="20"/>
+      </w:rPr>
+    </w:lvl>
+    <w:lvl w:ilvl="6" w:tentative="1">
+      <w:start w:val="1"/>
+      <w:numFmt w:val="bullet"/>
+      <w:lvlText w:val=""/>
+      <w:lvlJc w:val="left"/>
+      <w:pPr>
+        <w:tabs>
+          <w:tab w:val="num" w:pos="5040"/>
+        </w:tabs>
+        <w:ind w:left="5040" w:hanging="360"/>
+      </w:pPr>
+      <w:rPr>
+        <w:rFonts w:ascii="Wingdings" w:hAnsi="Wingdings" w:hint="default"/>
+        <w:sz w:val="20"/>
+      </w:rPr>
+    </w:lvl>
+    <w:lvl w:ilvl="7" w:tentative="1">
+      <w:start w:val="1"/>
+      <w:numFmt w:val="bullet"/>
+      <w:lvlText w:val=""/>
+      <w:lvlJc w:val="left"/>
+      <w:pPr>
+        <w:tabs>
+          <w:tab w:val="num" w:pos="5760"/>
+        </w:tabs>
+        <w:ind w:left="5760" w:hanging="360"/>
+      </w:pPr>
+      <w:rPr>
+        <w:rFonts w:ascii="Wingdings" w:hAnsi="Wingdings" w:hint="default"/>
+        <w:sz w:val="20"/>
+      </w:rPr>
+    </w:lvl>
+    <w:lvl w:ilvl="8" w:tentative="1">
+      <w:start w:val="1"/>
+      <w:numFmt w:val="bullet"/>
+      <w:lvlText w:val=""/>
+      <w:lvlJc w:val="left"/>
+      <w:pPr>
+        <w:tabs>
+          <w:tab w:val="num" w:pos="6480"/>
+        </w:tabs>
+        <w:ind w:left="6480" w:hanging="360"/>
+      </w:pPr>
+      <w:rPr>
+        <w:rFonts w:ascii="Wingdings" w:hAnsi="Wingdings" w:hint="default"/>
+        <w:sz w:val="20"/>
+      </w:rPr>
+    </w:lvl>
+  </w:abstractNum>
+  <w:abstractNum w:abstractNumId="10" w15:restartNumberingAfterBreak="0">
     <w:nsid w:val="5356578C"/>
     <w:multiLevelType w:val="hybridMultilevel"/>
     <w:tmpl w:val="2F80B634"/>
@@ -5917,7 +7557,7 @@
       </w:pPr>
     </w:lvl>
   </w:abstractNum>
-  <w:abstractNum w:abstractNumId="7" w15:restartNumberingAfterBreak="0">
+  <w:abstractNum w:abstractNumId="11" w15:restartNumberingAfterBreak="0">
     <w:nsid w:val="5BD37B2B"/>
     <w:multiLevelType w:val="hybridMultilevel"/>
     <w:tmpl w:val="ECA28112"/>
@@ -6003,7 +7643,156 @@
       </w:pPr>
     </w:lvl>
   </w:abstractNum>
-  <w:abstractNum w:abstractNumId="8" w15:restartNumberingAfterBreak="0">
+  <w:abstractNum w:abstractNumId="12" w15:restartNumberingAfterBreak="0">
+    <w:nsid w:val="635619FF"/>
+    <w:multiLevelType w:val="multilevel"/>
+    <w:tmpl w:val="1EE239AA"/>
+    <w:lvl w:ilvl="0">
+      <w:start w:val="1"/>
+      <w:numFmt w:val="bullet"/>
+      <w:lvlText w:val=""/>
+      <w:lvlJc w:val="left"/>
+      <w:pPr>
+        <w:tabs>
+          <w:tab w:val="num" w:pos="720"/>
+        </w:tabs>
+        <w:ind w:left="720" w:hanging="360"/>
+      </w:pPr>
+      <w:rPr>
+        <w:rFonts w:ascii="Symbol" w:hAnsi="Symbol" w:hint="default"/>
+        <w:sz w:val="20"/>
+      </w:rPr>
+    </w:lvl>
+    <w:lvl w:ilvl="1" w:tentative="1">
+      <w:start w:val="1"/>
+      <w:numFmt w:val="bullet"/>
+      <w:lvlText w:val="o"/>
+      <w:lvlJc w:val="left"/>
+      <w:pPr>
+        <w:tabs>
+          <w:tab w:val="num" w:pos="1440"/>
+        </w:tabs>
+        <w:ind w:left="1440" w:hanging="360"/>
+      </w:pPr>
+      <w:rPr>
+        <w:rFonts w:ascii="Courier New" w:hAnsi="Courier New" w:hint="default"/>
+        <w:sz w:val="20"/>
+      </w:rPr>
+    </w:lvl>
+    <w:lvl w:ilvl="2" w:tentative="1">
+      <w:start w:val="1"/>
+      <w:numFmt w:val="bullet"/>
+      <w:lvlText w:val=""/>
+      <w:lvlJc w:val="left"/>
+      <w:pPr>
+        <w:tabs>
+          <w:tab w:val="num" w:pos="2160"/>
+        </w:tabs>
+        <w:ind w:left="2160" w:hanging="360"/>
+      </w:pPr>
+      <w:rPr>
+        <w:rFonts w:ascii="Wingdings" w:hAnsi="Wingdings" w:hint="default"/>
+        <w:sz w:val="20"/>
+      </w:rPr>
+    </w:lvl>
+    <w:lvl w:ilvl="3" w:tentative="1">
+      <w:start w:val="1"/>
+      <w:numFmt w:val="bullet"/>
+      <w:lvlText w:val=""/>
+      <w:lvlJc w:val="left"/>
+      <w:pPr>
+        <w:tabs>
+          <w:tab w:val="num" w:pos="2880"/>
+        </w:tabs>
+        <w:ind w:left="2880" w:hanging="360"/>
+      </w:pPr>
+      <w:rPr>
+        <w:rFonts w:ascii="Wingdings" w:hAnsi="Wingdings" w:hint="default"/>
+        <w:sz w:val="20"/>
+      </w:rPr>
+    </w:lvl>
+    <w:lvl w:ilvl="4" w:tentative="1">
+      <w:start w:val="1"/>
+      <w:numFmt w:val="bullet"/>
+      <w:lvlText w:val=""/>
+      <w:lvlJc w:val="left"/>
+      <w:pPr>
+        <w:tabs>
+          <w:tab w:val="num" w:pos="3600"/>
+        </w:tabs>
+        <w:ind w:left="3600" w:hanging="360"/>
+      </w:pPr>
+      <w:rPr>
+        <w:rFonts w:ascii="Wingdings" w:hAnsi="Wingdings" w:hint="default"/>
+        <w:sz w:val="20"/>
+      </w:rPr>
+    </w:lvl>
+    <w:lvl w:ilvl="5" w:tentative="1">
+      <w:start w:val="1"/>
+      <w:numFmt w:val="bullet"/>
+      <w:lvlText w:val=""/>
+      <w:lvlJc w:val="left"/>
+      <w:pPr>
+        <w:tabs>
+          <w:tab w:val="num" w:pos="4320"/>
+        </w:tabs>
+        <w:ind w:left="4320" w:hanging="360"/>
+      </w:pPr>
+      <w:rPr>
+        <w:rFonts w:ascii="Wingdings" w:hAnsi="Wingdings" w:hint="default"/>
+        <w:sz w:val="20"/>
+      </w:rPr>
+    </w:lvl>
+    <w:lvl w:ilvl="6" w:tentative="1">
+      <w:start w:val="1"/>
+      <w:numFmt w:val="bullet"/>
+      <w:lvlText w:val=""/>
+      <w:lvlJc w:val="left"/>
+      <w:pPr>
+        <w:tabs>
+          <w:tab w:val="num" w:pos="5040"/>
+        </w:tabs>
+        <w:ind w:left="5040" w:hanging="360"/>
+      </w:pPr>
+      <w:rPr>
+        <w:rFonts w:ascii="Wingdings" w:hAnsi="Wingdings" w:hint="default"/>
+        <w:sz w:val="20"/>
+      </w:rPr>
+    </w:lvl>
+    <w:lvl w:ilvl="7" w:tentative="1">
+      <w:start w:val="1"/>
+      <w:numFmt w:val="bullet"/>
+      <w:lvlText w:val=""/>
+      <w:lvlJc w:val="left"/>
+      <w:pPr>
+        <w:tabs>
+          <w:tab w:val="num" w:pos="5760"/>
+        </w:tabs>
+        <w:ind w:left="5760" w:hanging="360"/>
+      </w:pPr>
+      <w:rPr>
+        <w:rFonts w:ascii="Wingdings" w:hAnsi="Wingdings" w:hint="default"/>
+        <w:sz w:val="20"/>
+      </w:rPr>
+    </w:lvl>
+    <w:lvl w:ilvl="8" w:tentative="1">
+      <w:start w:val="1"/>
+      <w:numFmt w:val="bullet"/>
+      <w:lvlText w:val=""/>
+      <w:lvlJc w:val="left"/>
+      <w:pPr>
+        <w:tabs>
+          <w:tab w:val="num" w:pos="6480"/>
+        </w:tabs>
+        <w:ind w:left="6480" w:hanging="360"/>
+      </w:pPr>
+      <w:rPr>
+        <w:rFonts w:ascii="Wingdings" w:hAnsi="Wingdings" w:hint="default"/>
+        <w:sz w:val="20"/>
+      </w:rPr>
+    </w:lvl>
+  </w:abstractNum>
+  <w:abstractNum w:abstractNumId="13" w15:restartNumberingAfterBreak="0">
     <w:nsid w:val="68AB4355"/>
     <w:multiLevelType w:val="hybridMultilevel"/>
     <w:tmpl w:val="0B203272"/>
@@ -6096,7 +7885,156 @@
       </w:pPr>
     </w:lvl>
   </w:abstractNum>
-  <w:abstractNum w:abstractNumId="9" w15:restartNumberingAfterBreak="0">
+  <w:abstractNum w:abstractNumId="14" w15:restartNumberingAfterBreak="0">
+    <w:nsid w:val="69FD61E1"/>
+    <w:multiLevelType w:val="multilevel"/>
+    <w:tmpl w:val="5B58C358"/>
+    <w:lvl w:ilvl="0">
+      <w:start w:val="1"/>
+      <w:numFmt w:val="bullet"/>
+      <w:lvlText w:val=""/>
+      <w:lvlJc w:val="left"/>
+      <w:pPr>
+        <w:tabs>
+          <w:tab w:val="num" w:pos="720"/>
+        </w:tabs>
+        <w:ind w:left="720" w:hanging="360"/>
+      </w:pPr>
+      <w:rPr>
+        <w:rFonts w:ascii="Symbol" w:hAnsi="Symbol" w:hint="default"/>
+        <w:sz w:val="20"/>
+      </w:rPr>
+    </w:lvl>
+    <w:lvl w:ilvl="1" w:tentative="1">
+      <w:start w:val="1"/>
+      <w:numFmt w:val="bullet"/>
+      <w:lvlText w:val="o"/>
+      <w:lvlJc w:val="left"/>
+      <w:pPr>
+        <w:tabs>
+          <w:tab w:val="num" w:pos="1440"/>
+        </w:tabs>
+        <w:ind w:left="1440" w:hanging="360"/>
+      </w:pPr>
+      <w:rPr>
+        <w:rFonts w:ascii="Courier New" w:hAnsi="Courier New" w:hint="default"/>
+        <w:sz w:val="20"/>
+      </w:rPr>
+    </w:lvl>
+    <w:lvl w:ilvl="2" w:tentative="1">
+      <w:start w:val="1"/>
+      <w:numFmt w:val="bullet"/>
+      <w:lvlText w:val=""/>
+      <w:lvlJc w:val="left"/>
+      <w:pPr>
+        <w:tabs>
+          <w:tab w:val="num" w:pos="2160"/>
+        </w:tabs>
+        <w:ind w:left="2160" w:hanging="360"/>
+      </w:pPr>
+      <w:rPr>
+        <w:rFonts w:ascii="Wingdings" w:hAnsi="Wingdings" w:hint="default"/>
+        <w:sz w:val="20"/>
+      </w:rPr>
+    </w:lvl>
+    <w:lvl w:ilvl="3" w:tentative="1">
+      <w:start w:val="1"/>
+      <w:numFmt w:val="bullet"/>
+      <w:lvlText w:val=""/>
+      <w:lvlJc w:val="left"/>
+      <w:pPr>
+        <w:tabs>
+          <w:tab w:val="num" w:pos="2880"/>
+        </w:tabs>
+        <w:ind w:left="2880" w:hanging="360"/>
+      </w:pPr>
+      <w:rPr>
+        <w:rFonts w:ascii="Wingdings" w:hAnsi="Wingdings" w:hint="default"/>
+        <w:sz w:val="20"/>
+      </w:rPr>
+    </w:lvl>
+    <w:lvl w:ilvl="4" w:tentative="1">
+      <w:start w:val="1"/>
+      <w:numFmt w:val="bullet"/>
+      <w:lvlText w:val=""/>
+      <w:lvlJc w:val="left"/>
+      <w:pPr>
+        <w:tabs>
+          <w:tab w:val="num" w:pos="3600"/>
+        </w:tabs>
+        <w:ind w:left="3600" w:hanging="360"/>
+      </w:pPr>
+      <w:rPr>
+        <w:rFonts w:ascii="Wingdings" w:hAnsi="Wingdings" w:hint="default"/>
+        <w:sz w:val="20"/>
+      </w:rPr>
+    </w:lvl>
+    <w:lvl w:ilvl="5" w:tentative="1">
+      <w:start w:val="1"/>
+      <w:numFmt w:val="bullet"/>
+      <w:lvlText w:val=""/>
+      <w:lvlJc w:val="left"/>
+      <w:pPr>
+        <w:tabs>
+          <w:tab w:val="num" w:pos="4320"/>
+        </w:tabs>
+        <w:ind w:left="4320" w:hanging="360"/>
+      </w:pPr>
+      <w:rPr>
+        <w:rFonts w:ascii="Wingdings" w:hAnsi="Wingdings" w:hint="default"/>
+        <w:sz w:val="20"/>
+      </w:rPr>
+    </w:lvl>
+    <w:lvl w:ilvl="6" w:tentative="1">
+      <w:start w:val="1"/>
+      <w:numFmt w:val="bullet"/>
+      <w:lvlText w:val=""/>
+      <w:lvlJc w:val="left"/>
+      <w:pPr>
+        <w:tabs>
+          <w:tab w:val="num" w:pos="5040"/>
+        </w:tabs>
+        <w:ind w:left="5040" w:hanging="360"/>
+      </w:pPr>
+      <w:rPr>
+        <w:rFonts w:ascii="Wingdings" w:hAnsi="Wingdings" w:hint="default"/>
+        <w:sz w:val="20"/>
+      </w:rPr>
+    </w:lvl>
+    <w:lvl w:ilvl="7" w:tentative="1">
+      <w:start w:val="1"/>
+      <w:numFmt w:val="bullet"/>
+      <w:lvlText w:val=""/>
+      <w:lvlJc w:val="left"/>
+      <w:pPr>
+        <w:tabs>
+          <w:tab w:val="num" w:pos="5760"/>
+        </w:tabs>
+        <w:ind w:left="5760" w:hanging="360"/>
+      </w:pPr>
+      <w:rPr>
+        <w:rFonts w:ascii="Wingdings" w:hAnsi="Wingdings" w:hint="default"/>
+        <w:sz w:val="20"/>
+      </w:rPr>
+    </w:lvl>
+    <w:lvl w:ilvl="8" w:tentative="1">
+      <w:start w:val="1"/>
+      <w:numFmt w:val="bullet"/>
+      <w:lvlText w:val=""/>
+      <w:lvlJc w:val="left"/>
+      <w:pPr>
+        <w:tabs>
+          <w:tab w:val="num" w:pos="6480"/>
+        </w:tabs>
+        <w:ind w:left="6480" w:hanging="360"/>
+      </w:pPr>
+      <w:rPr>
+        <w:rFonts w:ascii="Wingdings" w:hAnsi="Wingdings" w:hint="default"/>
+        <w:sz w:val="20"/>
+      </w:rPr>
+    </w:lvl>
+  </w:abstractNum>
+  <w:abstractNum w:abstractNumId="15" w15:restartNumberingAfterBreak="0">
     <w:nsid w:val="706A72C3"/>
     <w:multiLevelType w:val="hybridMultilevel"/>
     <w:tmpl w:val="B986F9E0"/>
@@ -6182,7 +8120,7 @@
       </w:pPr>
     </w:lvl>
   </w:abstractNum>
-  <w:abstractNum w:abstractNumId="10" w15:restartNumberingAfterBreak="0">
+  <w:abstractNum w:abstractNumId="16" w15:restartNumberingAfterBreak="0">
     <w:nsid w:val="72340135"/>
     <w:multiLevelType w:val="hybridMultilevel"/>
     <w:tmpl w:val="DDCED950"/>
@@ -6268,7 +8206,7 @@
       </w:pPr>
     </w:lvl>
   </w:abstractNum>
-  <w:abstractNum w:abstractNumId="11" w15:restartNumberingAfterBreak="0">
+  <w:abstractNum w:abstractNumId="17" w15:restartNumberingAfterBreak="0">
     <w:nsid w:val="73444766"/>
     <w:multiLevelType w:val="hybridMultilevel"/>
     <w:tmpl w:val="1988ED08"/>
@@ -6354,7 +8292,7 @@
       </w:pPr>
     </w:lvl>
   </w:abstractNum>
-  <w:abstractNum w:abstractNumId="12" w15:restartNumberingAfterBreak="0">
+  <w:abstractNum w:abstractNumId="18" w15:restartNumberingAfterBreak="0">
     <w:nsid w:val="76306763"/>
     <w:multiLevelType w:val="hybridMultilevel"/>
     <w:tmpl w:val="2F80B634"/>
@@ -6447,37 +8385,55 @@
     <w:abstractNumId w:val="0"/>
   </w:num>
   <w:num w:numId="3" w16cid:durableId="2129740968">
+    <w:abstractNumId w:val="5"/>
+  </w:num>
+  <w:num w:numId="4" w16cid:durableId="1238441298">
+    <w:abstractNumId w:val="13"/>
+  </w:num>
+  <w:num w:numId="5" w16cid:durableId="595990120">
+    <w:abstractNumId w:val="11"/>
+  </w:num>
+  <w:num w:numId="6" w16cid:durableId="700711369">
+    <w:abstractNumId w:val="4"/>
+  </w:num>
+  <w:num w:numId="7" w16cid:durableId="1040279297">
+    <w:abstractNumId w:val="15"/>
+  </w:num>
+  <w:num w:numId="8" w16cid:durableId="1196190869">
+    <w:abstractNumId w:val="17"/>
+  </w:num>
+  <w:num w:numId="9" w16cid:durableId="1632594104">
+    <w:abstractNumId w:val="7"/>
+  </w:num>
+  <w:num w:numId="10" w16cid:durableId="1629240801">
+    <w:abstractNumId w:val="6"/>
+  </w:num>
+  <w:num w:numId="11" w16cid:durableId="1890798395">
+    <w:abstractNumId w:val="10"/>
+  </w:num>
+  <w:num w:numId="12" w16cid:durableId="557478804">
+    <w:abstractNumId w:val="18"/>
+  </w:num>
+  <w:num w:numId="13" w16cid:durableId="1456556339">
+    <w:abstractNumId w:val="16"/>
+  </w:num>
+  <w:num w:numId="14" w16cid:durableId="1469710487">
+    <w:abstractNumId w:val="14"/>
+  </w:num>
+  <w:num w:numId="15" w16cid:durableId="548568110">
+    <w:abstractNumId w:val="2"/>
+  </w:num>
+  <w:num w:numId="16" w16cid:durableId="480775795">
+    <w:abstractNumId w:val="9"/>
+  </w:num>
+  <w:num w:numId="17" w16cid:durableId="1688869875">
     <w:abstractNumId w:val="3"/>
   </w:num>
-  <w:num w:numId="4" w16cid:durableId="1238441298">
-    <w:abstractNumId w:val="8"/>
-  </w:num>
-  <w:num w:numId="5" w16cid:durableId="595990120">
-    <w:abstractNumId w:val="7"/>
-  </w:num>
-  <w:num w:numId="6" w16cid:durableId="700711369">
-    <w:abstractNumId w:val="2"/>
-  </w:num>
-  <w:num w:numId="7" w16cid:durableId="1040279297">
-    <w:abstractNumId w:val="9"/>
-  </w:num>
-  <w:num w:numId="8" w16cid:durableId="1196190869">
-    <w:abstractNumId w:val="11"/>
-  </w:num>
-  <w:num w:numId="9" w16cid:durableId="1632594104">
-    <w:abstractNumId w:val="5"/>
-  </w:num>
-  <w:num w:numId="10" w16cid:durableId="1629240801">
-    <w:abstractNumId w:val="4"/>
-  </w:num>
-  <w:num w:numId="11" w16cid:durableId="1890798395">
-    <w:abstractNumId w:val="6"/>
-  </w:num>
-  <w:num w:numId="12" w16cid:durableId="557478804">
+  <w:num w:numId="18" w16cid:durableId="1490319779">
     <w:abstractNumId w:val="12"/>
   </w:num>
-  <w:num w:numId="13" w16cid:durableId="1456556339">
-    <w:abstractNumId w:val="10"/>
+  <w:num w:numId="19" w16cid:durableId="343091826">
+    <w:abstractNumId w:val="8"/>
   </w:num>
 </w:numbering>
 </file>
@@ -7080,6 +9036,7 @@
   <w:style w:type="character" w:default="1" w:styleId="DefaultParagraphFont">
     <w:name w:val="Default Paragraph Font"/>
     <w:uiPriority w:val="1"/>
+    <w:semiHidden/>
     <w:unhideWhenUsed/>
   </w:style>
   <w:style w:type="table" w:default="1" w:styleId="TableNormal">
@@ -7397,7 +9354,6 @@
     <w:name w:val="Emphasis"/>
     <w:basedOn w:val="DefaultParagraphFont"/>
     <w:uiPriority w:val="20"/>
-    <w:semiHidden/>
     <w:unhideWhenUsed/>
     <w:qFormat/>
     <w:rPr>
@@ -7424,7 +9380,6 @@
     <w:name w:val="Strong"/>
     <w:basedOn w:val="DefaultParagraphFont"/>
     <w:uiPriority w:val="22"/>
-    <w:semiHidden/>
     <w:unhideWhenUsed/>
     <w:qFormat/>
     <w:rPr>
@@ -7648,6 +9603,21 @@
       <w:color w:val="605E5C"/>
       <w:shd w:val="clear" w:color="auto" w:fill="E1DFDD"/>
     </w:rPr>
+  </w:style>
+  <w:style w:type="character" w:customStyle="1" w:styleId="apple-converted-space">
+    <w:name w:val="apple-converted-space"/>
+    <w:basedOn w:val="DefaultParagraphFont"/>
+    <w:rsid w:val="00E05955"/>
+  </w:style>
+  <w:style w:type="character" w:customStyle="1" w:styleId="katex-mathml">
+    <w:name w:val="katex-mathml"/>
+    <w:basedOn w:val="DefaultParagraphFont"/>
+    <w:rsid w:val="00E05955"/>
+  </w:style>
+  <w:style w:type="character" w:customStyle="1" w:styleId="mord">
+    <w:name w:val="mord"/>
+    <w:basedOn w:val="DefaultParagraphFont"/>
+    <w:rsid w:val="00E05955"/>
   </w:style>
 </w:styles>
 </file>

</xml_diff>